<commit_message>
Se agrega funcionalidad de diversos casos de uso, incluyendo la segunda versión de los casos de uso
</commit_message>
<xml_diff>
--- a/Casos de Uso/CU-01-Ingreso_Sistema.docx
+++ b/Casos de Uso/CU-01-Ingreso_Sistema.docx
@@ -1,10 +1,10 @@
 
 <file path=word/document.xml><?xml version="1.0" encoding="utf-8"?>
-<w:document xmlns:wpc="http://schemas.microsoft.com/office/word/2010/wordprocessingCanvas" xmlns:cx="http://schemas.microsoft.com/office/drawing/2014/chartex" xmlns:cx1="http://schemas.microsoft.com/office/drawing/2015/9/8/chartex" xmlns:cx2="http://schemas.microsoft.com/office/drawing/2015/10/21/chartex" xmlns:cx3="http://schemas.microsoft.com/office/drawing/2016/5/9/chartex" xmlns:cx4="http://schemas.microsoft.com/office/drawing/2016/5/10/chartex" xmlns:cx5="http://schemas.microsoft.com/office/drawing/2016/5/11/chartex" xmlns:cx6="http://schemas.microsoft.com/office/drawing/2016/5/12/chartex" xmlns:cx7="http://schemas.microsoft.com/office/drawing/2016/5/13/chartex" xmlns:cx8="http://schemas.microsoft.com/office/drawing/2016/5/14/chartex" xmlns:mc="http://schemas.openxmlformats.org/markup-compatibility/2006" xmlns:aink="http://schemas.microsoft.com/office/drawing/2016/ink" xmlns:am3d="http://schemas.microsoft.com/office/drawing/2017/model3d" xmlns:o="urn:schemas-microsoft-com:office:office" xmlns:oel="http://schemas.microsoft.com/office/2019/extlst" xmlns:r="http://schemas.openxmlformats.org/officeDocument/2006/relationships" xmlns:m="http://schemas.openxmlformats.org/officeDocument/2006/math" xmlns:v="urn:schemas-microsoft-com:vml" xmlns:wp14="http://schemas.microsoft.com/office/word/2010/wordprocessingDrawing" xmlns:wp="http://schemas.openxmlformats.org/drawingml/2006/wordprocessingDrawing" xmlns:w10="urn:schemas-microsoft-com:office:word" xmlns:w="http://schemas.openxmlformats.org/wordprocessingml/2006/main" xmlns:w14="http://schemas.microsoft.com/office/word/2010/wordml" xmlns:w15="http://schemas.microsoft.com/office/word/2012/wordml" xmlns:w16cex="http://schemas.microsoft.com/office/word/2018/wordml/cex" xmlns:w16cid="http://schemas.microsoft.com/office/word/2016/wordml/cid" xmlns:w16="http://schemas.microsoft.com/office/word/2018/wordml" xmlns:w16du="http://schemas.microsoft.com/office/word/2023/wordml/word16du" xmlns:w16sdtdh="http://schemas.microsoft.com/office/word/2020/wordml/sdtdatahash" xmlns:w16sdtfl="http://schemas.microsoft.com/office/word/2024/wordml/sdtformatlock" xmlns:w16se="http://schemas.microsoft.com/office/word/2015/wordml/symex" xmlns:wpg="http://schemas.microsoft.com/office/word/2010/wordprocessingGroup" xmlns:wpi="http://schemas.microsoft.com/office/word/2010/wordprocessingInk" xmlns:wne="http://schemas.microsoft.com/office/word/2006/wordml" xmlns:wps="http://schemas.microsoft.com/office/word/2010/wordprocessingShape" mc:Ignorable="w14 w15 w16se w16cid w16 w16cex w16sdtdh w16sdtfl w16du wp14">
+<w:document xmlns:wpc="http://schemas.microsoft.com/office/word/2010/wordprocessingCanvas" xmlns:cx="http://schemas.microsoft.com/office/drawing/2014/chartex" xmlns:cx1="http://schemas.microsoft.com/office/drawing/2015/9/8/chartex" xmlns:cx2="http://schemas.microsoft.com/office/drawing/2015/10/21/chartex" xmlns:cx3="http://schemas.microsoft.com/office/drawing/2016/5/9/chartex" xmlns:cx4="http://schemas.microsoft.com/office/drawing/2016/5/10/chartex" xmlns:cx5="http://schemas.microsoft.com/office/drawing/2016/5/11/chartex" xmlns:cx6="http://schemas.microsoft.com/office/drawing/2016/5/12/chartex" xmlns:cx7="http://schemas.microsoft.com/office/drawing/2016/5/13/chartex" xmlns:cx8="http://schemas.microsoft.com/office/drawing/2016/5/14/chartex" xmlns:mc="http://schemas.openxmlformats.org/markup-compatibility/2006" xmlns:aink="http://schemas.microsoft.com/office/drawing/2016/ink" xmlns:am3d="http://schemas.microsoft.com/office/drawing/2017/model3d" xmlns:o="urn:schemas-microsoft-com:office:office" xmlns:r="http://schemas.openxmlformats.org/officeDocument/2006/relationships" xmlns:m="http://schemas.openxmlformats.org/officeDocument/2006/math" xmlns:v="urn:schemas-microsoft-com:vml" xmlns:wp14="http://schemas.microsoft.com/office/word/2010/wordprocessingDrawing" xmlns:wp="http://schemas.openxmlformats.org/drawingml/2006/wordprocessingDrawing" xmlns:w10="urn:schemas-microsoft-com:office:word" xmlns:w="http://schemas.openxmlformats.org/wordprocessingml/2006/main" xmlns:w14="http://schemas.microsoft.com/office/word/2010/wordml" xmlns:w15="http://schemas.microsoft.com/office/word/2012/wordml" xmlns:w16cex="http://schemas.microsoft.com/office/word/2018/wordml/cex" xmlns:w16cid="http://schemas.microsoft.com/office/word/2016/wordml/cid" xmlns:w16="http://schemas.microsoft.com/office/word/2018/wordml" xmlns:w16sdtdh="http://schemas.microsoft.com/office/word/2020/wordml/sdtdatahash" xmlns:w16se="http://schemas.microsoft.com/office/word/2015/wordml/symex" xmlns:wpg="http://schemas.microsoft.com/office/word/2010/wordprocessingGroup" xmlns:wpi="http://schemas.microsoft.com/office/word/2010/wordprocessingInk" xmlns:wne="http://schemas.microsoft.com/office/word/2006/wordml" xmlns:wps="http://schemas.microsoft.com/office/word/2010/wordprocessingShape" mc:Ignorable="w14 w15 w16se w16cid w16 w16cex w16sdtdh wp14">
   <w:body>
     <w:p>
       <w:pPr>
-        <w:pStyle w:val="Ttulo"/>
+        <w:pStyle w:val="Title"/>
         <w:spacing w:before="0" w:after="0"/>
         <w:rPr>
           <w:lang w:val="es-ES"/>
@@ -19,7 +19,7 @@
     </w:p>
     <w:p>
       <w:pPr>
-        <w:pStyle w:val="Ttulo"/>
+        <w:pStyle w:val="Title"/>
         <w:spacing w:before="0" w:after="0"/>
         <w:rPr>
           <w:lang w:val="es-ES"/>
@@ -901,7 +901,7 @@
     </w:p>
     <w:p>
       <w:pPr>
-        <w:pStyle w:val="Ttulo1"/>
+        <w:pStyle w:val="Heading1"/>
         <w:numPr>
           <w:ilvl w:val="0"/>
           <w:numId w:val="38"/>
@@ -931,7 +931,7 @@
     </w:p>
     <w:p>
       <w:pPr>
-        <w:pStyle w:val="Ttulo2"/>
+        <w:pStyle w:val="Heading2"/>
         <w:numPr>
           <w:ilvl w:val="1"/>
           <w:numId w:val="38"/>
@@ -985,7 +985,7 @@
     </w:p>
     <w:p>
       <w:pPr>
-        <w:pStyle w:val="Ttulo1"/>
+        <w:pStyle w:val="Heading1"/>
         <w:numPr>
           <w:ilvl w:val="0"/>
           <w:numId w:val="38"/>
@@ -1015,7 +1015,7 @@
     </w:p>
     <w:p>
       <w:pPr>
-        <w:pStyle w:val="Ttulo2"/>
+        <w:pStyle w:val="Heading2"/>
         <w:numPr>
           <w:ilvl w:val="1"/>
           <w:numId w:val="38"/>
@@ -1116,7 +1116,7 @@
     </w:p>
     <w:p>
       <w:pPr>
-        <w:pStyle w:val="Ttulo2"/>
+        <w:pStyle w:val="Heading2"/>
         <w:numPr>
           <w:ilvl w:val="1"/>
           <w:numId w:val="38"/>
@@ -1196,7 +1196,7 @@
     </w:p>
     <w:p>
       <w:pPr>
-        <w:pStyle w:val="Ttulo2"/>
+        <w:pStyle w:val="Heading2"/>
         <w:numPr>
           <w:ilvl w:val="1"/>
           <w:numId w:val="38"/>
@@ -1279,47 +1279,7 @@
           <w:szCs w:val="20"/>
           <w:lang w:val="es-ES_tradnl"/>
         </w:rPr>
-        <w:t>El</w:t>
-      </w:r>
-      <w:r>
-        <w:rPr>
-          <w:sz w:val="20"/>
-          <w:szCs w:val="20"/>
-          <w:lang w:val="es-ES_tradnl"/>
-        </w:rPr>
-        <w:t xml:space="preserve"> sistema muestra el menú </w:t>
-      </w:r>
-      <w:r>
-        <w:rPr>
-          <w:sz w:val="20"/>
-          <w:szCs w:val="20"/>
-          <w:lang w:val="es-ES_tradnl"/>
-        </w:rPr>
-        <w:t>“</w:t>
-      </w:r>
-      <w:r>
-        <w:rPr>
-          <w:sz w:val="20"/>
-          <w:szCs w:val="20"/>
-          <w:lang w:val="es-ES_tradnl"/>
-        </w:rPr>
-        <w:t>Ingresar</w:t>
-      </w:r>
-      <w:r>
-        <w:rPr>
-          <w:sz w:val="20"/>
-          <w:szCs w:val="20"/>
-          <w:lang w:val="es-ES_tradnl"/>
-        </w:rPr>
-        <w:t>”</w:t>
-      </w:r>
-      <w:r>
-        <w:rPr>
-          <w:sz w:val="20"/>
-          <w:szCs w:val="20"/>
-          <w:lang w:val="es-ES_tradnl"/>
-        </w:rPr>
-        <w:t>.</w:t>
+        <w:t xml:space="preserve">El sistema muestra imagen del logotipo de la municipalidad </w:t>
       </w:r>
     </w:p>
     <w:p>
@@ -1340,6 +1300,88 @@
           <w:szCs w:val="20"/>
           <w:lang w:val="es-ES_tradnl"/>
         </w:rPr>
+        <w:t>El sistema muestra el título “Municipalidad de Granados, B.V”</w:t>
+      </w:r>
+    </w:p>
+    <w:p>
+      <w:pPr>
+        <w:numPr>
+          <w:ilvl w:val="0"/>
+          <w:numId w:val="42"/>
+        </w:numPr>
+        <w:rPr>
+          <w:sz w:val="20"/>
+          <w:szCs w:val="20"/>
+          <w:lang w:val="es-ES_tradnl"/>
+        </w:rPr>
+      </w:pPr>
+      <w:r>
+        <w:rPr>
+          <w:sz w:val="20"/>
+          <w:szCs w:val="20"/>
+          <w:lang w:val="es-ES_tradnl"/>
+        </w:rPr>
+        <w:t>El</w:t>
+      </w:r>
+      <w:r>
+        <w:rPr>
+          <w:sz w:val="20"/>
+          <w:szCs w:val="20"/>
+          <w:lang w:val="es-ES_tradnl"/>
+        </w:rPr>
+        <w:t xml:space="preserve"> sistema muestra el menú </w:t>
+      </w:r>
+      <w:r>
+        <w:rPr>
+          <w:sz w:val="20"/>
+          <w:szCs w:val="20"/>
+          <w:lang w:val="es-ES_tradnl"/>
+        </w:rPr>
+        <w:t>“</w:t>
+      </w:r>
+      <w:r>
+        <w:rPr>
+          <w:sz w:val="20"/>
+          <w:szCs w:val="20"/>
+          <w:lang w:val="es-ES_tradnl"/>
+        </w:rPr>
+        <w:t>Ingresar</w:t>
+      </w:r>
+      <w:r>
+        <w:rPr>
+          <w:sz w:val="20"/>
+          <w:szCs w:val="20"/>
+          <w:lang w:val="es-ES_tradnl"/>
+        </w:rPr>
+        <w:t>”</w:t>
+      </w:r>
+      <w:r>
+        <w:rPr>
+          <w:sz w:val="20"/>
+          <w:szCs w:val="20"/>
+          <w:lang w:val="es-ES_tradnl"/>
+        </w:rPr>
+        <w:t>.</w:t>
+      </w:r>
+    </w:p>
+    <w:p>
+      <w:pPr>
+        <w:numPr>
+          <w:ilvl w:val="0"/>
+          <w:numId w:val="42"/>
+        </w:numPr>
+        <w:rPr>
+          <w:sz w:val="20"/>
+          <w:szCs w:val="20"/>
+          <w:lang w:val="es-ES_tradnl"/>
+        </w:rPr>
+      </w:pPr>
+      <w:r>
+        <w:rPr>
+          <w:sz w:val="20"/>
+          <w:szCs w:val="20"/>
+          <w:lang w:val="es-ES_tradnl"/>
+        </w:rPr>
         <w:t>E</w:t>
       </w:r>
       <w:r>
@@ -1432,7 +1474,7 @@
           <w:szCs w:val="20"/>
           <w:lang w:val="es-ES_tradnl"/>
         </w:rPr>
-        <w:t>Visión</w:t>
+        <w:t>Imagen del logotipo de la Municipalidad</w:t>
       </w:r>
     </w:p>
     <w:p>
@@ -1453,6 +1495,27 @@
           <w:szCs w:val="20"/>
           <w:lang w:val="es-ES_tradnl"/>
         </w:rPr>
+        <w:t>Visión</w:t>
+      </w:r>
+    </w:p>
+    <w:p>
+      <w:pPr>
+        <w:numPr>
+          <w:ilvl w:val="1"/>
+          <w:numId w:val="42"/>
+        </w:numPr>
+        <w:rPr>
+          <w:sz w:val="20"/>
+          <w:szCs w:val="20"/>
+          <w:lang w:val="es-ES_tradnl"/>
+        </w:rPr>
+      </w:pPr>
+      <w:r>
+        <w:rPr>
+          <w:sz w:val="20"/>
+          <w:szCs w:val="20"/>
+          <w:lang w:val="es-ES_tradnl"/>
+        </w:rPr>
         <w:t>Misión</w:t>
       </w:r>
     </w:p>
@@ -1495,6 +1558,48 @@
           <w:szCs w:val="20"/>
           <w:lang w:val="es-ES_tradnl"/>
         </w:rPr>
+        <w:t>El sistema muestra una pantalla con el campo tipo lista seleccionable “Tipo de usuario”</w:t>
+      </w:r>
+    </w:p>
+    <w:p>
+      <w:pPr>
+        <w:numPr>
+          <w:ilvl w:val="0"/>
+          <w:numId w:val="42"/>
+        </w:numPr>
+        <w:rPr>
+          <w:sz w:val="20"/>
+          <w:szCs w:val="20"/>
+          <w:lang w:val="es-ES_tradnl"/>
+        </w:rPr>
+      </w:pPr>
+      <w:r>
+        <w:rPr>
+          <w:sz w:val="20"/>
+          <w:szCs w:val="20"/>
+          <w:lang w:val="es-ES_tradnl"/>
+        </w:rPr>
+        <w:t>El usuario selecciona su tipo de usuario.</w:t>
+      </w:r>
+    </w:p>
+    <w:p>
+      <w:pPr>
+        <w:numPr>
+          <w:ilvl w:val="0"/>
+          <w:numId w:val="42"/>
+        </w:numPr>
+        <w:rPr>
+          <w:sz w:val="20"/>
+          <w:szCs w:val="20"/>
+          <w:lang w:val="en-US"/>
+        </w:rPr>
+      </w:pPr>
+      <w:r>
+        <w:rPr>
+          <w:sz w:val="20"/>
+          <w:szCs w:val="20"/>
+          <w:lang w:val="es-ES_tradnl"/>
+        </w:rPr>
         <w:t xml:space="preserve">El sistema muestra los campos del formulario </w:t>
       </w:r>
       <w:r>
@@ -1511,7 +1616,7 @@
           <w:bCs/>
           <w:sz w:val="20"/>
           <w:szCs w:val="20"/>
-          <w:lang w:val="es-ES_tradnl"/>
+          <w:lang w:val="en-US"/>
         </w:rPr>
         <w:t>RN</w:t>
       </w:r>
@@ -1521,9 +1626,59 @@
           <w:bCs/>
           <w:sz w:val="20"/>
           <w:szCs w:val="20"/>
-          <w:lang w:val="es-ES_tradnl"/>
+          <w:lang w:val="en-US"/>
         </w:rPr>
         <w:t>08</w:t>
+      </w:r>
+      <w:r>
+        <w:rPr>
+          <w:b/>
+          <w:bCs/>
+          <w:sz w:val="20"/>
+          <w:szCs w:val="20"/>
+          <w:lang w:val="en-US"/>
+        </w:rPr>
+        <w:t xml:space="preserve">, NOT02, AN02#12, </w:t>
+      </w:r>
+      <w:r>
+        <w:rPr>
+          <w:b/>
+          <w:bCs/>
+          <w:sz w:val="20"/>
+          <w:szCs w:val="20"/>
+          <w:lang w:val="en-US"/>
+        </w:rPr>
+        <w:t>AN02#1</w:t>
+      </w:r>
+      <w:r>
+        <w:rPr>
+          <w:b/>
+          <w:bCs/>
+          <w:sz w:val="20"/>
+          <w:szCs w:val="20"/>
+          <w:lang w:val="en-US"/>
+        </w:rPr>
+        <w:t>4</w:t>
+      </w:r>
+      <w:r>
+        <w:rPr>
+          <w:b/>
+          <w:bCs/>
+          <w:sz w:val="20"/>
+          <w:szCs w:val="20"/>
+          <w:lang w:val="en-US"/>
+        </w:rPr>
+        <w:t xml:space="preserve">, </w:t>
+      </w:r>
+      <w:r>
+        <w:rPr>
+          <w:b/>
+          <w:bCs/>
+          <w:sz w:val="20"/>
+          <w:szCs w:val="20"/>
+          <w:lang w:val="en-US"/>
+        </w:rPr>
+        <w:t>AN01#1</w:t>
       </w:r>
     </w:p>
     <w:p>
@@ -1628,7 +1783,7 @@
           <w:szCs w:val="20"/>
           <w:lang w:val="es-ES_tradnl"/>
         </w:rPr>
-        <w:t>El usuario llena el formulario de ingreso.</w:t>
+        <w:t>El sistema muestra el botón “Regresar”.</w:t>
       </w:r>
     </w:p>
     <w:p>
@@ -1649,15 +1804,7 @@
           <w:szCs w:val="20"/>
           <w:lang w:val="es-ES_tradnl"/>
         </w:rPr>
-        <w:t xml:space="preserve">El </w:t>
-      </w:r>
-      <w:r>
-        <w:rPr>
-          <w:sz w:val="20"/>
-          <w:szCs w:val="20"/>
-          <w:lang w:val="es-ES_tradnl"/>
-        </w:rPr>
-        <w:t>usuario selecciona el botón “Acceder”.</w:t>
+        <w:t>El usuario llena el formulario de ingreso.</w:t>
       </w:r>
     </w:p>
     <w:p>
@@ -1678,33 +1825,15 @@
           <w:szCs w:val="20"/>
           <w:lang w:val="es-ES_tradnl"/>
         </w:rPr>
-        <w:t>E</w:t>
-      </w:r>
-      <w:r>
-        <w:rPr>
-          <w:sz w:val="20"/>
-          <w:szCs w:val="20"/>
-          <w:lang w:val="es-ES_tradnl"/>
-        </w:rPr>
-        <w:t>l sistema valida que el usuario cuente con rol válido y que las credenciales sean correctas.</w:t>
-      </w:r>
-      <w:r>
-        <w:rPr>
-          <w:sz w:val="20"/>
-          <w:szCs w:val="20"/>
-          <w:lang w:val="es-ES_tradnl"/>
-        </w:rPr>
-        <w:t xml:space="preserve"> </w:t>
-      </w:r>
-      <w:r>
-        <w:rPr>
-          <w:b/>
-          <w:bCs/>
-          <w:sz w:val="20"/>
-          <w:szCs w:val="20"/>
-          <w:lang w:val="es-ES_tradnl"/>
-        </w:rPr>
-        <w:t>FA01</w:t>
+        <w:t xml:space="preserve">El </w:t>
+      </w:r>
+      <w:r>
+        <w:rPr>
+          <w:sz w:val="20"/>
+          <w:szCs w:val="20"/>
+          <w:lang w:val="es-ES_tradnl"/>
+        </w:rPr>
+        <w:t>usuario selecciona el botón “Acceder”.</w:t>
       </w:r>
     </w:p>
     <w:p>
@@ -1725,15 +1854,25 @@
           <w:szCs w:val="20"/>
           <w:lang w:val="es-ES_tradnl"/>
         </w:rPr>
-        <w:t xml:space="preserve">El sistema </w:t>
-      </w:r>
-      <w:r>
-        <w:rPr>
-          <w:sz w:val="20"/>
-          <w:szCs w:val="20"/>
-          <w:lang w:val="es-ES_tradnl"/>
-        </w:rPr>
-        <w:t>permite el ingreso a la bandeja principal del sistema.</w:t>
+        <w:t>E</w:t>
+      </w:r>
+      <w:r>
+        <w:rPr>
+          <w:sz w:val="20"/>
+          <w:szCs w:val="20"/>
+          <w:lang w:val="es-ES_tradnl"/>
+        </w:rPr>
+        <w:t xml:space="preserve">l sistema valida que el usuario cuente con rol válido y que las credenciales sean correctas. </w:t>
+      </w:r>
+      <w:r>
+        <w:rPr>
+          <w:b/>
+          <w:bCs/>
+          <w:sz w:val="20"/>
+          <w:szCs w:val="20"/>
+          <w:lang w:val="es-ES_tradnl"/>
+        </w:rPr>
+        <w:t>FA01</w:t>
       </w:r>
     </w:p>
     <w:p>
@@ -1754,7 +1893,15 @@
           <w:szCs w:val="20"/>
           <w:lang w:val="es-ES_tradnl"/>
         </w:rPr>
-        <w:t>El sistema registra el ingreso en bitácora.</w:t>
+        <w:t xml:space="preserve">El sistema </w:t>
+      </w:r>
+      <w:r>
+        <w:rPr>
+          <w:sz w:val="20"/>
+          <w:szCs w:val="20"/>
+          <w:lang w:val="es-ES_tradnl"/>
+        </w:rPr>
+        <w:t>permite el ingreso a la bandeja principal del sistema.</w:t>
       </w:r>
     </w:p>
     <w:p>
@@ -1775,12 +1922,33 @@
           <w:szCs w:val="20"/>
           <w:lang w:val="es-ES_tradnl"/>
         </w:rPr>
-        <w:t>Fin del caso de uso.</w:t>
+        <w:t>El sistema registra el ingreso en bitácora.</w:t>
       </w:r>
     </w:p>
     <w:p>
       <w:pPr>
-        <w:pStyle w:val="Ttulo2"/>
+        <w:numPr>
+          <w:ilvl w:val="0"/>
+          <w:numId w:val="42"/>
+        </w:numPr>
+        <w:rPr>
+          <w:sz w:val="20"/>
+          <w:szCs w:val="20"/>
+          <w:lang w:val="es-ES_tradnl"/>
+        </w:rPr>
+      </w:pPr>
+      <w:r>
+        <w:rPr>
+          <w:sz w:val="20"/>
+          <w:szCs w:val="20"/>
+          <w:lang w:val="es-ES_tradnl"/>
+        </w:rPr>
+        <w:t>Fin del caso de uso.</w:t>
+      </w:r>
+    </w:p>
+    <w:p>
+      <w:pPr>
+        <w:pStyle w:val="Heading2"/>
         <w:numPr>
           <w:ilvl w:val="1"/>
           <w:numId w:val="38"/>
@@ -1918,23 +2086,7 @@
           <w:szCs w:val="20"/>
           <w:lang w:val="es-ES_tradnl"/>
         </w:rPr>
-        <w:t>El sistema retorna al paso</w:t>
-      </w:r>
-      <w:r>
-        <w:rPr>
-          <w:sz w:val="20"/>
-          <w:szCs w:val="20"/>
-          <w:lang w:val="es-ES_tradnl"/>
-        </w:rPr>
-        <w:t xml:space="preserve"> 5 </w:t>
-      </w:r>
-      <w:r>
-        <w:rPr>
-          <w:sz w:val="20"/>
-          <w:szCs w:val="20"/>
-          <w:lang w:val="es-ES_tradnl"/>
-        </w:rPr>
-        <w:t>del flujo básico.</w:t>
+        <w:t>El usuario selecciona el botón “Regresar”</w:t>
       </w:r>
     </w:p>
     <w:p>
@@ -1955,6 +2107,27 @@
           <w:szCs w:val="20"/>
           <w:lang w:val="es-ES_tradnl"/>
         </w:rPr>
+        <w:t>El sistema retorna al paso 1 del flujo normal básico</w:t>
+      </w:r>
+    </w:p>
+    <w:p>
+      <w:pPr>
+        <w:numPr>
+          <w:ilvl w:val="0"/>
+          <w:numId w:val="43"/>
+        </w:numPr>
+        <w:rPr>
+          <w:sz w:val="20"/>
+          <w:szCs w:val="20"/>
+          <w:lang w:val="es-ES_tradnl"/>
+        </w:rPr>
+      </w:pPr>
+      <w:r>
+        <w:rPr>
+          <w:sz w:val="20"/>
+          <w:szCs w:val="20"/>
+          <w:lang w:val="es-ES_tradnl"/>
+        </w:rPr>
         <w:t xml:space="preserve">Fin de </w:t>
       </w:r>
       <w:r>
@@ -2102,6 +2275,7 @@
           <w:szCs w:val="20"/>
           <w:lang w:val="es-ES_tradnl"/>
         </w:rPr>
+        <w:lastRenderedPageBreak/>
         <w:t xml:space="preserve">Fin de </w:t>
       </w:r>
       <w:r>
@@ -2123,7 +2297,7 @@
     </w:p>
     <w:p>
       <w:pPr>
-        <w:pStyle w:val="Ttulo2"/>
+        <w:pStyle w:val="Heading2"/>
         <w:numPr>
           <w:ilvl w:val="1"/>
           <w:numId w:val="38"/>
@@ -2203,7 +2377,7 @@
     </w:p>
     <w:p>
       <w:pPr>
-        <w:pStyle w:val="Ttulo1"/>
+        <w:pStyle w:val="Heading1"/>
         <w:numPr>
           <w:ilvl w:val="0"/>
           <w:numId w:val="38"/>
@@ -2220,7 +2394,6 @@
           <w:szCs w:val="28"/>
           <w:lang w:val="es-ES_tradnl"/>
         </w:rPr>
-        <w:lastRenderedPageBreak/>
         <w:t xml:space="preserve">Requerimientos </w:t>
       </w:r>
       <w:r>
@@ -2305,7 +2478,7 @@
     </w:p>
     <w:p>
       <w:pPr>
-        <w:pStyle w:val="Ttulo1"/>
+        <w:pStyle w:val="Heading1"/>
         <w:numPr>
           <w:ilvl w:val="0"/>
           <w:numId w:val="38"/>
@@ -2612,7 +2785,7 @@
 </file>
 
 <file path=word/endnotes.xml><?xml version="1.0" encoding="utf-8"?>
-<w:endnotes xmlns:wpc="http://schemas.microsoft.com/office/word/2010/wordprocessingCanvas" xmlns:cx="http://schemas.microsoft.com/office/drawing/2014/chartex" xmlns:cx1="http://schemas.microsoft.com/office/drawing/2015/9/8/chartex" xmlns:cx2="http://schemas.microsoft.com/office/drawing/2015/10/21/chartex" xmlns:cx3="http://schemas.microsoft.com/office/drawing/2016/5/9/chartex" xmlns:cx4="http://schemas.microsoft.com/office/drawing/2016/5/10/chartex" xmlns:cx5="http://schemas.microsoft.com/office/drawing/2016/5/11/chartex" xmlns:cx6="http://schemas.microsoft.com/office/drawing/2016/5/12/chartex" xmlns:cx7="http://schemas.microsoft.com/office/drawing/2016/5/13/chartex" xmlns:cx8="http://schemas.microsoft.com/office/drawing/2016/5/14/chartex" xmlns:mc="http://schemas.openxmlformats.org/markup-compatibility/2006" xmlns:aink="http://schemas.microsoft.com/office/drawing/2016/ink" xmlns:am3d="http://schemas.microsoft.com/office/drawing/2017/model3d" xmlns:o="urn:schemas-microsoft-com:office:office" xmlns:oel="http://schemas.microsoft.com/office/2019/extlst" xmlns:r="http://schemas.openxmlformats.org/officeDocument/2006/relationships" xmlns:m="http://schemas.openxmlformats.org/officeDocument/2006/math" xmlns:v="urn:schemas-microsoft-com:vml" xmlns:wp14="http://schemas.microsoft.com/office/word/2010/wordprocessingDrawing" xmlns:wp="http://schemas.openxmlformats.org/drawingml/2006/wordprocessingDrawing" xmlns:w10="urn:schemas-microsoft-com:office:word" xmlns:w="http://schemas.openxmlformats.org/wordprocessingml/2006/main" xmlns:w14="http://schemas.microsoft.com/office/word/2010/wordml" xmlns:w15="http://schemas.microsoft.com/office/word/2012/wordml" xmlns:w16cex="http://schemas.microsoft.com/office/word/2018/wordml/cex" xmlns:w16cid="http://schemas.microsoft.com/office/word/2016/wordml/cid" xmlns:w16="http://schemas.microsoft.com/office/word/2018/wordml" xmlns:w16du="http://schemas.microsoft.com/office/word/2023/wordml/word16du" xmlns:w16sdtdh="http://schemas.microsoft.com/office/word/2020/wordml/sdtdatahash" xmlns:w16sdtfl="http://schemas.microsoft.com/office/word/2024/wordml/sdtformatlock" xmlns:w16se="http://schemas.microsoft.com/office/word/2015/wordml/symex" xmlns:wpg="http://schemas.microsoft.com/office/word/2010/wordprocessingGroup" xmlns:wpi="http://schemas.microsoft.com/office/word/2010/wordprocessingInk" xmlns:wne="http://schemas.microsoft.com/office/word/2006/wordml" xmlns:wps="http://schemas.microsoft.com/office/word/2010/wordprocessingShape" mc:Ignorable="w14 w15 w16se w16cid w16 w16cex w16sdtdh w16sdtfl w16du wp14">
+<w:endnotes xmlns:wpc="http://schemas.microsoft.com/office/word/2010/wordprocessingCanvas" xmlns:cx="http://schemas.microsoft.com/office/drawing/2014/chartex" xmlns:cx1="http://schemas.microsoft.com/office/drawing/2015/9/8/chartex" xmlns:cx2="http://schemas.microsoft.com/office/drawing/2015/10/21/chartex" xmlns:cx3="http://schemas.microsoft.com/office/drawing/2016/5/9/chartex" xmlns:cx4="http://schemas.microsoft.com/office/drawing/2016/5/10/chartex" xmlns:cx5="http://schemas.microsoft.com/office/drawing/2016/5/11/chartex" xmlns:cx6="http://schemas.microsoft.com/office/drawing/2016/5/12/chartex" xmlns:cx7="http://schemas.microsoft.com/office/drawing/2016/5/13/chartex" xmlns:cx8="http://schemas.microsoft.com/office/drawing/2016/5/14/chartex" xmlns:mc="http://schemas.openxmlformats.org/markup-compatibility/2006" xmlns:aink="http://schemas.microsoft.com/office/drawing/2016/ink" xmlns:am3d="http://schemas.microsoft.com/office/drawing/2017/model3d" xmlns:o="urn:schemas-microsoft-com:office:office" xmlns:r="http://schemas.openxmlformats.org/officeDocument/2006/relationships" xmlns:m="http://schemas.openxmlformats.org/officeDocument/2006/math" xmlns:v="urn:schemas-microsoft-com:vml" xmlns:wp14="http://schemas.microsoft.com/office/word/2010/wordprocessingDrawing" xmlns:wp="http://schemas.openxmlformats.org/drawingml/2006/wordprocessingDrawing" xmlns:w10="urn:schemas-microsoft-com:office:word" xmlns:w="http://schemas.openxmlformats.org/wordprocessingml/2006/main" xmlns:w14="http://schemas.microsoft.com/office/word/2010/wordml" xmlns:w15="http://schemas.microsoft.com/office/word/2012/wordml" xmlns:w16cex="http://schemas.microsoft.com/office/word/2018/wordml/cex" xmlns:w16cid="http://schemas.microsoft.com/office/word/2016/wordml/cid" xmlns:w16="http://schemas.microsoft.com/office/word/2018/wordml" xmlns:w16sdtdh="http://schemas.microsoft.com/office/word/2020/wordml/sdtdatahash" xmlns:w16se="http://schemas.microsoft.com/office/word/2015/wordml/symex" xmlns:wpg="http://schemas.microsoft.com/office/word/2010/wordprocessingGroup" xmlns:wpi="http://schemas.microsoft.com/office/word/2010/wordprocessingInk" xmlns:wne="http://schemas.microsoft.com/office/word/2006/wordml" xmlns:wps="http://schemas.microsoft.com/office/word/2010/wordprocessingShape" mc:Ignorable="w14 w15 w16se w16cid w16 w16cex w16sdtdh wp14">
   <w:endnote w:type="separator" w:id="-1">
     <w:p>
       <w:r>
@@ -2631,7 +2804,7 @@
 </file>
 
 <file path=word/footnotes.xml><?xml version="1.0" encoding="utf-8"?>
-<w:footnotes xmlns:wpc="http://schemas.microsoft.com/office/word/2010/wordprocessingCanvas" xmlns:cx="http://schemas.microsoft.com/office/drawing/2014/chartex" xmlns:cx1="http://schemas.microsoft.com/office/drawing/2015/9/8/chartex" xmlns:cx2="http://schemas.microsoft.com/office/drawing/2015/10/21/chartex" xmlns:cx3="http://schemas.microsoft.com/office/drawing/2016/5/9/chartex" xmlns:cx4="http://schemas.microsoft.com/office/drawing/2016/5/10/chartex" xmlns:cx5="http://schemas.microsoft.com/office/drawing/2016/5/11/chartex" xmlns:cx6="http://schemas.microsoft.com/office/drawing/2016/5/12/chartex" xmlns:cx7="http://schemas.microsoft.com/office/drawing/2016/5/13/chartex" xmlns:cx8="http://schemas.microsoft.com/office/drawing/2016/5/14/chartex" xmlns:mc="http://schemas.openxmlformats.org/markup-compatibility/2006" xmlns:aink="http://schemas.microsoft.com/office/drawing/2016/ink" xmlns:am3d="http://schemas.microsoft.com/office/drawing/2017/model3d" xmlns:o="urn:schemas-microsoft-com:office:office" xmlns:oel="http://schemas.microsoft.com/office/2019/extlst" xmlns:r="http://schemas.openxmlformats.org/officeDocument/2006/relationships" xmlns:m="http://schemas.openxmlformats.org/officeDocument/2006/math" xmlns:v="urn:schemas-microsoft-com:vml" xmlns:wp14="http://schemas.microsoft.com/office/word/2010/wordprocessingDrawing" xmlns:wp="http://schemas.openxmlformats.org/drawingml/2006/wordprocessingDrawing" xmlns:w10="urn:schemas-microsoft-com:office:word" xmlns:w="http://schemas.openxmlformats.org/wordprocessingml/2006/main" xmlns:w14="http://schemas.microsoft.com/office/word/2010/wordml" xmlns:w15="http://schemas.microsoft.com/office/word/2012/wordml" xmlns:w16cex="http://schemas.microsoft.com/office/word/2018/wordml/cex" xmlns:w16cid="http://schemas.microsoft.com/office/word/2016/wordml/cid" xmlns:w16="http://schemas.microsoft.com/office/word/2018/wordml" xmlns:w16du="http://schemas.microsoft.com/office/word/2023/wordml/word16du" xmlns:w16sdtdh="http://schemas.microsoft.com/office/word/2020/wordml/sdtdatahash" xmlns:w16sdtfl="http://schemas.microsoft.com/office/word/2024/wordml/sdtformatlock" xmlns:w16se="http://schemas.microsoft.com/office/word/2015/wordml/symex" xmlns:wpg="http://schemas.microsoft.com/office/word/2010/wordprocessingGroup" xmlns:wpi="http://schemas.microsoft.com/office/word/2010/wordprocessingInk" xmlns:wne="http://schemas.microsoft.com/office/word/2006/wordml" xmlns:wps="http://schemas.microsoft.com/office/word/2010/wordprocessingShape" mc:Ignorable="w14 w15 w16se w16cid w16 w16cex w16sdtdh w16sdtfl w16du wp14">
+<w:footnotes xmlns:wpc="http://schemas.microsoft.com/office/word/2010/wordprocessingCanvas" xmlns:cx="http://schemas.microsoft.com/office/drawing/2014/chartex" xmlns:cx1="http://schemas.microsoft.com/office/drawing/2015/9/8/chartex" xmlns:cx2="http://schemas.microsoft.com/office/drawing/2015/10/21/chartex" xmlns:cx3="http://schemas.microsoft.com/office/drawing/2016/5/9/chartex" xmlns:cx4="http://schemas.microsoft.com/office/drawing/2016/5/10/chartex" xmlns:cx5="http://schemas.microsoft.com/office/drawing/2016/5/11/chartex" xmlns:cx6="http://schemas.microsoft.com/office/drawing/2016/5/12/chartex" xmlns:cx7="http://schemas.microsoft.com/office/drawing/2016/5/13/chartex" xmlns:cx8="http://schemas.microsoft.com/office/drawing/2016/5/14/chartex" xmlns:mc="http://schemas.openxmlformats.org/markup-compatibility/2006" xmlns:aink="http://schemas.microsoft.com/office/drawing/2016/ink" xmlns:am3d="http://schemas.microsoft.com/office/drawing/2017/model3d" xmlns:o="urn:schemas-microsoft-com:office:office" xmlns:r="http://schemas.openxmlformats.org/officeDocument/2006/relationships" xmlns:m="http://schemas.openxmlformats.org/officeDocument/2006/math" xmlns:v="urn:schemas-microsoft-com:vml" xmlns:wp14="http://schemas.microsoft.com/office/word/2010/wordprocessingDrawing" xmlns:wp="http://schemas.openxmlformats.org/drawingml/2006/wordprocessingDrawing" xmlns:w10="urn:schemas-microsoft-com:office:word" xmlns:w="http://schemas.openxmlformats.org/wordprocessingml/2006/main" xmlns:w14="http://schemas.microsoft.com/office/word/2010/wordml" xmlns:w15="http://schemas.microsoft.com/office/word/2012/wordml" xmlns:w16cex="http://schemas.microsoft.com/office/word/2018/wordml/cex" xmlns:w16cid="http://schemas.microsoft.com/office/word/2016/wordml/cid" xmlns:w16="http://schemas.microsoft.com/office/word/2018/wordml" xmlns:w16sdtdh="http://schemas.microsoft.com/office/word/2020/wordml/sdtdatahash" xmlns:w16se="http://schemas.microsoft.com/office/word/2015/wordml/symex" xmlns:wpg="http://schemas.microsoft.com/office/word/2010/wordprocessingGroup" xmlns:wpi="http://schemas.microsoft.com/office/word/2010/wordprocessingInk" xmlns:wne="http://schemas.microsoft.com/office/word/2006/wordml" xmlns:wps="http://schemas.microsoft.com/office/word/2010/wordprocessingShape" mc:Ignorable="w14 w15 w16se w16cid w16 w16cex w16sdtdh wp14">
   <w:footnote w:type="separator" w:id="-1">
     <w:p>
       <w:r>
@@ -2650,7 +2823,7 @@
 </file>
 
 <file path=word/numbering.xml><?xml version="1.0" encoding="utf-8"?>
-<w:numbering xmlns:wpc="http://schemas.microsoft.com/office/word/2010/wordprocessingCanvas" xmlns:cx="http://schemas.microsoft.com/office/drawing/2014/chartex" xmlns:cx1="http://schemas.microsoft.com/office/drawing/2015/9/8/chartex" xmlns:cx2="http://schemas.microsoft.com/office/drawing/2015/10/21/chartex" xmlns:cx3="http://schemas.microsoft.com/office/drawing/2016/5/9/chartex" xmlns:cx4="http://schemas.microsoft.com/office/drawing/2016/5/10/chartex" xmlns:cx5="http://schemas.microsoft.com/office/drawing/2016/5/11/chartex" xmlns:cx6="http://schemas.microsoft.com/office/drawing/2016/5/12/chartex" xmlns:cx7="http://schemas.microsoft.com/office/drawing/2016/5/13/chartex" xmlns:cx8="http://schemas.microsoft.com/office/drawing/2016/5/14/chartex" xmlns:mc="http://schemas.openxmlformats.org/markup-compatibility/2006" xmlns:aink="http://schemas.microsoft.com/office/drawing/2016/ink" xmlns:am3d="http://schemas.microsoft.com/office/drawing/2017/model3d" xmlns:o="urn:schemas-microsoft-com:office:office" xmlns:oel="http://schemas.microsoft.com/office/2019/extlst" xmlns:r="http://schemas.openxmlformats.org/officeDocument/2006/relationships" xmlns:m="http://schemas.openxmlformats.org/officeDocument/2006/math" xmlns:v="urn:schemas-microsoft-com:vml" xmlns:wp14="http://schemas.microsoft.com/office/word/2010/wordprocessingDrawing" xmlns:wp="http://schemas.openxmlformats.org/drawingml/2006/wordprocessingDrawing" xmlns:w10="urn:schemas-microsoft-com:office:word" xmlns:w="http://schemas.openxmlformats.org/wordprocessingml/2006/main" xmlns:w14="http://schemas.microsoft.com/office/word/2010/wordml" xmlns:w15="http://schemas.microsoft.com/office/word/2012/wordml" xmlns:w16cex="http://schemas.microsoft.com/office/word/2018/wordml/cex" xmlns:w16cid="http://schemas.microsoft.com/office/word/2016/wordml/cid" xmlns:w16="http://schemas.microsoft.com/office/word/2018/wordml" xmlns:w16du="http://schemas.microsoft.com/office/word/2023/wordml/word16du" xmlns:w16sdtdh="http://schemas.microsoft.com/office/word/2020/wordml/sdtdatahash" xmlns:w16sdtfl="http://schemas.microsoft.com/office/word/2024/wordml/sdtformatlock" xmlns:w16se="http://schemas.microsoft.com/office/word/2015/wordml/symex" xmlns:wpg="http://schemas.microsoft.com/office/word/2010/wordprocessingGroup" xmlns:wpi="http://schemas.microsoft.com/office/word/2010/wordprocessingInk" xmlns:wne="http://schemas.microsoft.com/office/word/2006/wordml" xmlns:wps="http://schemas.microsoft.com/office/word/2010/wordprocessingShape" mc:Ignorable="w14 w15 w16se w16cid w16 w16cex w16sdtdh w16sdtfl w16du wp14">
+<w:numbering xmlns:wpc="http://schemas.microsoft.com/office/word/2010/wordprocessingCanvas" xmlns:cx="http://schemas.microsoft.com/office/drawing/2014/chartex" xmlns:cx1="http://schemas.microsoft.com/office/drawing/2015/9/8/chartex" xmlns:cx2="http://schemas.microsoft.com/office/drawing/2015/10/21/chartex" xmlns:cx3="http://schemas.microsoft.com/office/drawing/2016/5/9/chartex" xmlns:cx4="http://schemas.microsoft.com/office/drawing/2016/5/10/chartex" xmlns:cx5="http://schemas.microsoft.com/office/drawing/2016/5/11/chartex" xmlns:cx6="http://schemas.microsoft.com/office/drawing/2016/5/12/chartex" xmlns:cx7="http://schemas.microsoft.com/office/drawing/2016/5/13/chartex" xmlns:cx8="http://schemas.microsoft.com/office/drawing/2016/5/14/chartex" xmlns:mc="http://schemas.openxmlformats.org/markup-compatibility/2006" xmlns:aink="http://schemas.microsoft.com/office/drawing/2016/ink" xmlns:am3d="http://schemas.microsoft.com/office/drawing/2017/model3d" xmlns:o="urn:schemas-microsoft-com:office:office" xmlns:r="http://schemas.openxmlformats.org/officeDocument/2006/relationships" xmlns:m="http://schemas.openxmlformats.org/officeDocument/2006/math" xmlns:v="urn:schemas-microsoft-com:vml" xmlns:wp14="http://schemas.microsoft.com/office/word/2010/wordprocessingDrawing" xmlns:wp="http://schemas.openxmlformats.org/drawingml/2006/wordprocessingDrawing" xmlns:w10="urn:schemas-microsoft-com:office:word" xmlns:w="http://schemas.openxmlformats.org/wordprocessingml/2006/main" xmlns:w14="http://schemas.microsoft.com/office/word/2010/wordml" xmlns:w15="http://schemas.microsoft.com/office/word/2012/wordml" xmlns:w16cex="http://schemas.microsoft.com/office/word/2018/wordml/cex" xmlns:w16cid="http://schemas.microsoft.com/office/word/2016/wordml/cid" xmlns:w16="http://schemas.microsoft.com/office/word/2018/wordml" xmlns:w16sdtdh="http://schemas.microsoft.com/office/word/2020/wordml/sdtdatahash" xmlns:w16se="http://schemas.microsoft.com/office/word/2015/wordml/symex" xmlns:wpg="http://schemas.microsoft.com/office/word/2010/wordprocessingGroup" xmlns:wpi="http://schemas.microsoft.com/office/word/2010/wordprocessingInk" xmlns:wne="http://schemas.microsoft.com/office/word/2006/wordml" xmlns:wps="http://schemas.microsoft.com/office/word/2010/wordprocessingShape" mc:Ignorable="w14 w15 w16se w16cid w16 w16cex w16sdtdh wp14">
   <w:abstractNum w:abstractNumId="0" w15:restartNumberingAfterBreak="0">
     <w:nsid w:val="02F81A67"/>
     <w:multiLevelType w:val="multilevel"/>
@@ -6672,154 +6845,154 @@
       </w:pPr>
     </w:lvl>
   </w:abstractNum>
-  <w:num w:numId="1" w16cid:durableId="92675463">
+  <w:num w:numId="1">
     <w:abstractNumId w:val="21"/>
   </w:num>
-  <w:num w:numId="2" w16cid:durableId="9646972">
+  <w:num w:numId="2">
     <w:abstractNumId w:val="2"/>
   </w:num>
-  <w:num w:numId="3" w16cid:durableId="1465387613">
+  <w:num w:numId="3">
     <w:abstractNumId w:val="0"/>
   </w:num>
-  <w:num w:numId="4" w16cid:durableId="868878119">
+  <w:num w:numId="4">
     <w:abstractNumId w:val="19"/>
   </w:num>
-  <w:num w:numId="5" w16cid:durableId="317073932">
+  <w:num w:numId="5">
     <w:abstractNumId w:val="13"/>
   </w:num>
-  <w:num w:numId="6" w16cid:durableId="1314991140">
+  <w:num w:numId="6">
     <w:abstractNumId w:val="7"/>
   </w:num>
-  <w:num w:numId="7" w16cid:durableId="1803644919">
+  <w:num w:numId="7">
     <w:abstractNumId w:val="5"/>
   </w:num>
-  <w:num w:numId="8" w16cid:durableId="1285306350">
+  <w:num w:numId="8">
     <w:abstractNumId w:val="32"/>
   </w:num>
-  <w:num w:numId="9" w16cid:durableId="1608852186">
+  <w:num w:numId="9">
     <w:abstractNumId w:val="15"/>
   </w:num>
-  <w:num w:numId="10" w16cid:durableId="318776908">
+  <w:num w:numId="10">
     <w:abstractNumId w:val="3"/>
   </w:num>
-  <w:num w:numId="11" w16cid:durableId="942229777">
+  <w:num w:numId="11">
     <w:abstractNumId w:val="24"/>
   </w:num>
-  <w:num w:numId="12" w16cid:durableId="1584804162">
+  <w:num w:numId="12">
     <w:abstractNumId w:val="30"/>
   </w:num>
-  <w:num w:numId="13" w16cid:durableId="1070425762">
+  <w:num w:numId="13">
     <w:abstractNumId w:val="6"/>
   </w:num>
-  <w:num w:numId="14" w16cid:durableId="869076511">
+  <w:num w:numId="14">
     <w:abstractNumId w:val="14"/>
   </w:num>
-  <w:num w:numId="15" w16cid:durableId="829365271">
+  <w:num w:numId="15">
     <w:abstractNumId w:val="36"/>
   </w:num>
-  <w:num w:numId="16" w16cid:durableId="71590705">
+  <w:num w:numId="16">
     <w:abstractNumId w:val="41"/>
   </w:num>
-  <w:num w:numId="17" w16cid:durableId="2040163226">
+  <w:num w:numId="17">
     <w:abstractNumId w:val="18"/>
   </w:num>
-  <w:num w:numId="18" w16cid:durableId="86076378">
+  <w:num w:numId="18">
     <w:abstractNumId w:val="9"/>
   </w:num>
-  <w:num w:numId="19" w16cid:durableId="1497067419">
+  <w:num w:numId="19">
     <w:abstractNumId w:val="35"/>
   </w:num>
-  <w:num w:numId="20" w16cid:durableId="2015573296">
+  <w:num w:numId="20">
     <w:abstractNumId w:val="39"/>
   </w:num>
-  <w:num w:numId="21" w16cid:durableId="1746338517">
+  <w:num w:numId="21">
     <w:abstractNumId w:val="10"/>
   </w:num>
-  <w:num w:numId="22" w16cid:durableId="1273784354">
+  <w:num w:numId="22">
     <w:abstractNumId w:val="44"/>
   </w:num>
-  <w:num w:numId="23" w16cid:durableId="1332832785">
+  <w:num w:numId="23">
     <w:abstractNumId w:val="42"/>
   </w:num>
-  <w:num w:numId="24" w16cid:durableId="1394425790">
+  <w:num w:numId="24">
     <w:abstractNumId w:val="8"/>
   </w:num>
-  <w:num w:numId="25" w16cid:durableId="1786538249">
+  <w:num w:numId="25">
     <w:abstractNumId w:val="31"/>
   </w:num>
-  <w:num w:numId="26" w16cid:durableId="1680081112">
+  <w:num w:numId="26">
     <w:abstractNumId w:val="1"/>
   </w:num>
-  <w:num w:numId="27" w16cid:durableId="475335952">
+  <w:num w:numId="27">
     <w:abstractNumId w:val="23"/>
   </w:num>
-  <w:num w:numId="28" w16cid:durableId="265158819">
+  <w:num w:numId="28">
     <w:abstractNumId w:val="4"/>
   </w:num>
-  <w:num w:numId="29" w16cid:durableId="390740487">
+  <w:num w:numId="29">
     <w:abstractNumId w:val="29"/>
   </w:num>
-  <w:num w:numId="30" w16cid:durableId="2025936779">
+  <w:num w:numId="30">
     <w:abstractNumId w:val="16"/>
   </w:num>
-  <w:num w:numId="31" w16cid:durableId="2041203810">
+  <w:num w:numId="31">
     <w:abstractNumId w:val="33"/>
   </w:num>
-  <w:num w:numId="32" w16cid:durableId="21979014">
+  <w:num w:numId="32">
     <w:abstractNumId w:val="28"/>
   </w:num>
-  <w:num w:numId="33" w16cid:durableId="958993428">
+  <w:num w:numId="33">
     <w:abstractNumId w:val="27"/>
   </w:num>
-  <w:num w:numId="34" w16cid:durableId="285160095">
+  <w:num w:numId="34">
     <w:abstractNumId w:val="17"/>
   </w:num>
-  <w:num w:numId="35" w16cid:durableId="282002516">
+  <w:num w:numId="35">
     <w:abstractNumId w:val="26"/>
   </w:num>
-  <w:num w:numId="36" w16cid:durableId="546375817">
+  <w:num w:numId="36">
     <w:abstractNumId w:val="12"/>
   </w:num>
-  <w:num w:numId="37" w16cid:durableId="921373981">
+  <w:num w:numId="37">
     <w:abstractNumId w:val="40"/>
   </w:num>
-  <w:num w:numId="38" w16cid:durableId="1808007548">
+  <w:num w:numId="38">
     <w:abstractNumId w:val="11"/>
   </w:num>
-  <w:num w:numId="39" w16cid:durableId="1589773985">
+  <w:num w:numId="39">
     <w:abstractNumId w:val="43"/>
   </w:num>
-  <w:num w:numId="40" w16cid:durableId="1732073307">
+  <w:num w:numId="40">
     <w:abstractNumId w:val="45"/>
   </w:num>
-  <w:num w:numId="41" w16cid:durableId="404033391">
+  <w:num w:numId="41">
     <w:abstractNumId w:val="22"/>
   </w:num>
-  <w:num w:numId="42" w16cid:durableId="704909327">
+  <w:num w:numId="42">
     <w:abstractNumId w:val="25"/>
   </w:num>
-  <w:num w:numId="43" w16cid:durableId="85352136">
+  <w:num w:numId="43">
     <w:abstractNumId w:val="34"/>
   </w:num>
-  <w:num w:numId="44" w16cid:durableId="1266689001">
+  <w:num w:numId="44">
     <w:abstractNumId w:val="38"/>
   </w:num>
-  <w:num w:numId="45" w16cid:durableId="325287613">
+  <w:num w:numId="45">
     <w:abstractNumId w:val="37"/>
   </w:num>
-  <w:num w:numId="46" w16cid:durableId="2058242464">
+  <w:num w:numId="46">
     <w:abstractNumId w:val="20"/>
   </w:num>
 </w:numbering>
 </file>
 
 <file path=word/styles.xml><?xml version="1.0" encoding="utf-8"?>
-<w:styles xmlns:mc="http://schemas.openxmlformats.org/markup-compatibility/2006" xmlns:r="http://schemas.openxmlformats.org/officeDocument/2006/relationships" xmlns:w="http://schemas.openxmlformats.org/wordprocessingml/2006/main" xmlns:w14="http://schemas.microsoft.com/office/word/2010/wordml" xmlns:w15="http://schemas.microsoft.com/office/word/2012/wordml" xmlns:w16cex="http://schemas.microsoft.com/office/word/2018/wordml/cex" xmlns:w16cid="http://schemas.microsoft.com/office/word/2016/wordml/cid" xmlns:w16="http://schemas.microsoft.com/office/word/2018/wordml" xmlns:w16du="http://schemas.microsoft.com/office/word/2023/wordml/word16du" xmlns:w16sdtdh="http://schemas.microsoft.com/office/word/2020/wordml/sdtdatahash" xmlns:w16sdtfl="http://schemas.microsoft.com/office/word/2024/wordml/sdtformatlock" xmlns:w16se="http://schemas.microsoft.com/office/word/2015/wordml/symex" mc:Ignorable="w14 w15 w16se w16cid w16 w16cex w16sdtdh w16sdtfl w16du">
+<w:styles xmlns:mc="http://schemas.openxmlformats.org/markup-compatibility/2006" xmlns:r="http://schemas.openxmlformats.org/officeDocument/2006/relationships" xmlns:w="http://schemas.openxmlformats.org/wordprocessingml/2006/main" xmlns:w14="http://schemas.microsoft.com/office/word/2010/wordml" xmlns:w15="http://schemas.microsoft.com/office/word/2012/wordml" xmlns:w16cex="http://schemas.microsoft.com/office/word/2018/wordml/cex" xmlns:w16cid="http://schemas.microsoft.com/office/word/2016/wordml/cid" xmlns:w16="http://schemas.microsoft.com/office/word/2018/wordml" xmlns:w16sdtdh="http://schemas.microsoft.com/office/word/2020/wordml/sdtdatahash" xmlns:w16se="http://schemas.microsoft.com/office/word/2015/wordml/symex" mc:Ignorable="w14 w15 w16se w16cid w16 w16cex w16sdtdh">
   <w:docDefaults>
     <w:rPrDefault>
       <w:rPr>
         <w:rFonts w:ascii="Times New Roman" w:eastAsia="Times New Roman" w:hAnsi="Times New Roman" w:cs="Times New Roman"/>
-        <w:lang w:val="es-GT" w:eastAsia="es-GT" w:bidi="ar-SA"/>
+        <w:lang w:val="es-419" w:eastAsia="es-419" w:bidi="ar-SA"/>
       </w:rPr>
     </w:rPrDefault>
     <w:pPrDefault/>
@@ -7118,7 +7291,7 @@
       <w:lang w:val="es-ES" w:eastAsia="es-ES"/>
     </w:rPr>
   </w:style>
-  <w:style w:type="paragraph" w:styleId="Ttulo1">
+  <w:style w:type="paragraph" w:styleId="Heading1">
     <w:name w:val="heading 1"/>
     <w:basedOn w:val="Normal"/>
     <w:qFormat/>
@@ -7135,7 +7308,7 @@
       <w:szCs w:val="48"/>
     </w:rPr>
   </w:style>
-  <w:style w:type="paragraph" w:styleId="Ttulo2">
+  <w:style w:type="paragraph" w:styleId="Heading2">
     <w:name w:val="heading 2"/>
     <w:basedOn w:val="Normal"/>
     <w:qFormat/>
@@ -7151,13 +7324,13 @@
       <w:szCs w:val="36"/>
     </w:rPr>
   </w:style>
-  <w:style w:type="character" w:default="1" w:styleId="Fuentedeprrafopredeter">
+  <w:style w:type="character" w:default="1" w:styleId="DefaultParagraphFont">
     <w:name w:val="Default Paragraph Font"/>
     <w:uiPriority w:val="1"/>
     <w:semiHidden/>
     <w:unhideWhenUsed/>
   </w:style>
-  <w:style w:type="table" w:default="1" w:styleId="Tablanormal">
+  <w:style w:type="table" w:default="1" w:styleId="TableNormal">
     <w:name w:val="Normal Table"/>
     <w:uiPriority w:val="99"/>
     <w:semiHidden/>
@@ -7172,7 +7345,7 @@
       </w:tblCellMar>
     </w:tblPr>
   </w:style>
-  <w:style w:type="numbering" w:default="1" w:styleId="Sinlista">
+  <w:style w:type="numbering" w:default="1" w:styleId="NoList">
     <w:name w:val="No List"/>
     <w:uiPriority w:val="99"/>
     <w:semiHidden/>
@@ -7186,7 +7359,7 @@
       <w:spacing w:before="100" w:beforeAutospacing="1" w:after="100" w:afterAutospacing="1"/>
     </w:pPr>
   </w:style>
-  <w:style w:type="paragraph" w:styleId="TDC1">
+  <w:style w:type="paragraph" w:styleId="TOC1">
     <w:name w:val="toc 1"/>
     <w:basedOn w:val="Normal"/>
     <w:rsid w:val="000D097C"/>
@@ -7194,7 +7367,7 @@
       <w:spacing w:before="100" w:beforeAutospacing="1" w:after="100" w:afterAutospacing="1"/>
     </w:pPr>
   </w:style>
-  <w:style w:type="character" w:styleId="Hipervnculo">
+  <w:style w:type="character" w:styleId="Hyperlink">
     <w:name w:val="Hyperlink"/>
     <w:rsid w:val="000D097C"/>
     <w:rPr>
@@ -7202,7 +7375,7 @@
       <w:u w:val="single"/>
     </w:rPr>
   </w:style>
-  <w:style w:type="paragraph" w:styleId="TDC2">
+  <w:style w:type="paragraph" w:styleId="TOC2">
     <w:name w:val="toc 2"/>
     <w:basedOn w:val="Normal"/>
     <w:rsid w:val="000D097C"/>
@@ -7210,7 +7383,7 @@
       <w:spacing w:before="100" w:beforeAutospacing="1" w:after="100" w:afterAutospacing="1"/>
     </w:pPr>
   </w:style>
-  <w:style w:type="paragraph" w:styleId="Sangra3detindependiente">
+  <w:style w:type="paragraph" w:styleId="BodyTextIndent3">
     <w:name w:val="Body Text Indent 3"/>
     <w:basedOn w:val="Normal"/>
     <w:rsid w:val="000D097C"/>
@@ -7218,10 +7391,10 @@
       <w:spacing w:before="100" w:beforeAutospacing="1" w:after="100" w:afterAutospacing="1"/>
     </w:pPr>
   </w:style>
-  <w:style w:type="paragraph" w:styleId="Encabezado">
+  <w:style w:type="paragraph" w:styleId="Header">
     <w:name w:val="header"/>
     <w:basedOn w:val="Normal"/>
-    <w:link w:val="EncabezadoCar"/>
+    <w:link w:val="HeaderChar"/>
     <w:uiPriority w:val="99"/>
     <w:rsid w:val="000D097C"/>
     <w:pPr>
@@ -7238,16 +7411,16 @@
   </w:style>
   <w:style w:type="paragraph" w:customStyle="1" w:styleId="ByLine">
     <w:name w:val="ByLine"/>
-    <w:basedOn w:val="Ttulo"/>
+    <w:basedOn w:val="Title"/>
     <w:rsid w:val="00F6349F"/>
     <w:rPr>
       <w:sz w:val="28"/>
     </w:rPr>
   </w:style>
-  <w:style w:type="paragraph" w:styleId="Ttulo">
+  <w:style w:type="paragraph" w:styleId="Title">
     <w:name w:val="Title"/>
     <w:basedOn w:val="Normal"/>
-    <w:link w:val="TtuloCar"/>
+    <w:link w:val="TitleChar"/>
     <w:qFormat/>
     <w:rsid w:val="00F6349F"/>
     <w:pPr>
@@ -7263,9 +7436,9 @@
       <w:lang w:val="en-US" w:eastAsia="en-US"/>
     </w:rPr>
   </w:style>
-  <w:style w:type="character" w:customStyle="1" w:styleId="TtuloCar">
-    <w:name w:val="Título Car"/>
-    <w:link w:val="Ttulo"/>
+  <w:style w:type="character" w:customStyle="1" w:styleId="TitleChar">
+    <w:name w:val="Title Char"/>
+    <w:link w:val="Title"/>
     <w:rsid w:val="00F6349F"/>
     <w:rPr>
       <w:rFonts w:ascii="Arial" w:hAnsi="Arial"/>
@@ -7292,12 +7465,12 @@
       <w:lang w:val="en-US" w:eastAsia="en-US"/>
     </w:rPr>
   </w:style>
-  <w:style w:type="character" w:styleId="Nmerodelnea">
+  <w:style w:type="character" w:styleId="LineNumber">
     <w:name w:val="line number"/>
-    <w:basedOn w:val="Fuentedeprrafopredeter"/>
+    <w:basedOn w:val="DefaultParagraphFont"/>
     <w:rsid w:val="008F2F81"/>
   </w:style>
-  <w:style w:type="paragraph" w:styleId="Prrafodelista">
+  <w:style w:type="paragraph" w:styleId="ListParagraph">
     <w:name w:val="List Paragraph"/>
     <w:basedOn w:val="Normal"/>
     <w:uiPriority w:val="34"/>
@@ -7307,10 +7480,10 @@
       <w:ind w:left="708"/>
     </w:pPr>
   </w:style>
-  <w:style w:type="paragraph" w:styleId="Piedepgina">
+  <w:style w:type="paragraph" w:styleId="Footer">
     <w:name w:val="footer"/>
     <w:basedOn w:val="Normal"/>
-    <w:link w:val="PiedepginaCar"/>
+    <w:link w:val="FooterChar"/>
     <w:uiPriority w:val="99"/>
     <w:rsid w:val="00344F2B"/>
     <w:pPr>
@@ -7320,9 +7493,9 @@
       </w:tabs>
     </w:pPr>
   </w:style>
-  <w:style w:type="character" w:customStyle="1" w:styleId="PiedepginaCar">
-    <w:name w:val="Pie de página Car"/>
-    <w:link w:val="Piedepgina"/>
+  <w:style w:type="character" w:customStyle="1" w:styleId="FooterChar">
+    <w:name w:val="Footer Char"/>
+    <w:link w:val="Footer"/>
     <w:uiPriority w:val="99"/>
     <w:rsid w:val="00344F2B"/>
     <w:rPr>
@@ -7331,9 +7504,9 @@
       <w:lang w:val="es-ES" w:eastAsia="es-ES"/>
     </w:rPr>
   </w:style>
-  <w:style w:type="character" w:customStyle="1" w:styleId="EncabezadoCar">
-    <w:name w:val="Encabezado Car"/>
-    <w:link w:val="Encabezado"/>
+  <w:style w:type="character" w:customStyle="1" w:styleId="HeaderChar">
+    <w:name w:val="Header Char"/>
+    <w:link w:val="Header"/>
     <w:uiPriority w:val="99"/>
     <w:rsid w:val="00344F2B"/>
     <w:rPr>
@@ -7342,10 +7515,10 @@
       <w:lang w:val="es-ES" w:eastAsia="es-ES"/>
     </w:rPr>
   </w:style>
-  <w:style w:type="paragraph" w:styleId="Textodeglobo">
+  <w:style w:type="paragraph" w:styleId="BalloonText">
     <w:name w:val="Balloon Text"/>
     <w:basedOn w:val="Normal"/>
-    <w:link w:val="TextodegloboCar"/>
+    <w:link w:val="BalloonTextChar"/>
     <w:rsid w:val="00344F2B"/>
     <w:rPr>
       <w:rFonts w:ascii="Tahoma" w:hAnsi="Tahoma" w:cs="Tahoma"/>
@@ -7353,9 +7526,9 @@
       <w:szCs w:val="16"/>
     </w:rPr>
   </w:style>
-  <w:style w:type="character" w:customStyle="1" w:styleId="TextodegloboCar">
-    <w:name w:val="Texto de globo Car"/>
-    <w:link w:val="Textodeglobo"/>
+  <w:style w:type="character" w:customStyle="1" w:styleId="BalloonTextChar">
+    <w:name w:val="Balloon Text Char"/>
+    <w:link w:val="BalloonText"/>
     <w:rsid w:val="00344F2B"/>
     <w:rPr>
       <w:rFonts w:ascii="Tahoma" w:hAnsi="Tahoma" w:cs="Tahoma"/>
@@ -7364,18 +7537,18 @@
       <w:lang w:val="es-ES" w:eastAsia="es-ES"/>
     </w:rPr>
   </w:style>
-  <w:style w:type="paragraph" w:styleId="Textoindependiente">
+  <w:style w:type="paragraph" w:styleId="BodyText">
     <w:name w:val="Body Text"/>
     <w:basedOn w:val="Normal"/>
-    <w:link w:val="TextoindependienteCar"/>
+    <w:link w:val="BodyTextChar"/>
     <w:rsid w:val="00FF438A"/>
     <w:pPr>
       <w:spacing w:after="120"/>
     </w:pPr>
   </w:style>
-  <w:style w:type="character" w:customStyle="1" w:styleId="TextoindependienteCar">
-    <w:name w:val="Texto independiente Car"/>
-    <w:link w:val="Textoindependiente"/>
+  <w:style w:type="character" w:customStyle="1" w:styleId="BodyTextChar">
+    <w:name w:val="Body Text Char"/>
+    <w:link w:val="BodyText"/>
     <w:rsid w:val="00FF438A"/>
     <w:rPr>
       <w:sz w:val="24"/>
@@ -7383,32 +7556,32 @@
       <w:lang w:val="es-ES" w:eastAsia="es-ES"/>
     </w:rPr>
   </w:style>
-  <w:style w:type="paragraph" w:styleId="Textonotaalfinal">
+  <w:style w:type="paragraph" w:styleId="EndnoteText">
     <w:name w:val="endnote text"/>
     <w:basedOn w:val="Normal"/>
-    <w:link w:val="TextonotaalfinalCar"/>
+    <w:link w:val="EndnoteTextChar"/>
     <w:rsid w:val="00A83ADC"/>
     <w:rPr>
       <w:sz w:val="20"/>
       <w:szCs w:val="20"/>
     </w:rPr>
   </w:style>
-  <w:style w:type="character" w:customStyle="1" w:styleId="TextonotaalfinalCar">
-    <w:name w:val="Texto nota al final Car"/>
-    <w:link w:val="Textonotaalfinal"/>
+  <w:style w:type="character" w:customStyle="1" w:styleId="EndnoteTextChar">
+    <w:name w:val="Endnote Text Char"/>
+    <w:link w:val="EndnoteText"/>
     <w:rsid w:val="00A83ADC"/>
     <w:rPr>
       <w:lang w:val="es-ES" w:eastAsia="es-ES"/>
     </w:rPr>
   </w:style>
-  <w:style w:type="character" w:styleId="Refdenotaalfinal">
+  <w:style w:type="character" w:styleId="EndnoteReference">
     <w:name w:val="endnote reference"/>
     <w:rsid w:val="00A83ADC"/>
     <w:rPr>
       <w:vertAlign w:val="superscript"/>
     </w:rPr>
   </w:style>
-  <w:style w:type="paragraph" w:styleId="Revisin">
+  <w:style w:type="paragraph" w:styleId="Revision">
     <w:name w:val="Revision"/>
     <w:hidden/>
     <w:uiPriority w:val="99"/>
@@ -7420,9 +7593,9 @@
       <w:lang w:val="es-ES" w:eastAsia="es-ES"/>
     </w:rPr>
   </w:style>
-  <w:style w:type="table" w:styleId="Tablaconcuadrcula">
+  <w:style w:type="table" w:styleId="TableGrid">
     <w:name w:val="Table Grid"/>
-    <w:basedOn w:val="Tablanormal"/>
+    <w:basedOn w:val="TableNormal"/>
     <w:uiPriority w:val="1"/>
     <w:rsid w:val="00557FB4"/>
     <w:rPr>

</xml_diff>

<commit_message>
Se corrigen los casos de uso 1, 2, 3 y se agrega el formato de imagenes en la evidencia al registrar el caso, se añaden reglas de negocio
</commit_message>
<xml_diff>
--- a/Casos de Uso/CU-01-Ingreso_Sistema.docx
+++ b/Casos de Uso/CU-01-Ingreso_Sistema.docx
@@ -574,6 +574,13 @@
                 <w:lang w:val="es-GT"/>
               </w:rPr>
             </w:pPr>
+            <w:r>
+              <w:rPr>
+                <w:noProof/>
+                <w:lang w:val="es-GT"/>
+              </w:rPr>
+              <w:t>Grupo 1 Análisis de Sistemas</w:t>
+            </w:r>
           </w:p>
         </w:tc>
         <w:tc>
@@ -594,6 +601,13 @@
                 <w:lang w:val="es-GT"/>
               </w:rPr>
             </w:pPr>
+            <w:r>
+              <w:rPr>
+                <w:noProof/>
+                <w:lang w:val="es-GT"/>
+              </w:rPr>
+              <w:t>07/10/20</w:t>
+            </w:r>
           </w:p>
         </w:tc>
         <w:tc>
@@ -614,6 +628,13 @@
                 <w:lang w:val="es-GT"/>
               </w:rPr>
             </w:pPr>
+            <w:r>
+              <w:rPr>
+                <w:noProof/>
+                <w:lang w:val="es-GT"/>
+              </w:rPr>
+              <w:t>Se agregarón especificaciones acerca de lo que se muestra en pantalla</w:t>
+            </w:r>
           </w:p>
         </w:tc>
         <w:tc>
@@ -634,6 +655,13 @@
                 <w:lang w:val="es-GT"/>
               </w:rPr>
             </w:pPr>
+            <w:r>
+              <w:rPr>
+                <w:noProof/>
+                <w:lang w:val="es-GT"/>
+              </w:rPr>
+              <w:t>1.0</w:t>
+            </w:r>
           </w:p>
         </w:tc>
       </w:tr>
@@ -1638,27 +1666,7 @@
           <w:szCs w:val="20"/>
           <w:lang w:val="en-US"/>
         </w:rPr>
-        <w:t xml:space="preserve">, NOT02, AN02#12, </w:t>
-      </w:r>
-      <w:r>
-        <w:rPr>
-          <w:b/>
-          <w:bCs/>
-          <w:sz w:val="20"/>
-          <w:szCs w:val="20"/>
-          <w:lang w:val="en-US"/>
-        </w:rPr>
-        <w:t>AN02#1</w:t>
-      </w:r>
-      <w:r>
-        <w:rPr>
-          <w:b/>
-          <w:bCs/>
-          <w:sz w:val="20"/>
-          <w:szCs w:val="20"/>
-          <w:lang w:val="en-US"/>
-        </w:rPr>
-        <w:t>4</w:t>
+        <w:t>, NOT02, AN02#12, AN02#14</w:t>
       </w:r>
       <w:r>
         <w:rPr>
@@ -1923,6 +1931,37 @@
           <w:lang w:val="es-ES_tradnl"/>
         </w:rPr>
         <w:t>El sistema registra el ingreso en bitácora.</w:t>
+      </w:r>
+    </w:p>
+    <w:p>
+      <w:pPr>
+        <w:numPr>
+          <w:ilvl w:val="0"/>
+          <w:numId w:val="42"/>
+        </w:numPr>
+        <w:rPr>
+          <w:sz w:val="20"/>
+          <w:szCs w:val="20"/>
+          <w:lang w:val="es-ES_tradnl"/>
+        </w:rPr>
+      </w:pPr>
+      <w:r>
+        <w:rPr>
+          <w:sz w:val="20"/>
+          <w:szCs w:val="20"/>
+          <w:lang w:val="es-ES_tradnl"/>
+        </w:rPr>
+        <w:t xml:space="preserve">El usuario selecciona el botón “Cerrar sesión” </w:t>
+      </w:r>
+      <w:r>
+        <w:rPr>
+          <w:b/>
+          <w:bCs/>
+          <w:sz w:val="20"/>
+          <w:szCs w:val="20"/>
+          <w:lang w:val="es-ES_tradnl"/>
+        </w:rPr>
+        <w:t>FA02</w:t>
       </w:r>
     </w:p>
     <w:p>
@@ -2238,6 +2277,7 @@
           <w:szCs w:val="20"/>
           <w:lang w:val="es-ES_tradnl"/>
         </w:rPr>
+        <w:lastRenderedPageBreak/>
         <w:t>El sistema retorna al porta</w:t>
       </w:r>
       <w:r>
@@ -2275,7 +2315,6 @@
           <w:szCs w:val="20"/>
           <w:lang w:val="es-ES_tradnl"/>
         </w:rPr>
-        <w:lastRenderedPageBreak/>
         <w:t xml:space="preserve">Fin de </w:t>
       </w:r>
       <w:r>

</xml_diff>

<commit_message>
Se corrige la reasignación de casos a los diferentes empleados, se añaden reglas de negocio y correción de flujos alternos de los primeros 4 casos de uso
</commit_message>
<xml_diff>
--- a/Casos de Uso/CU-01-Ingreso_Sistema.docx
+++ b/Casos de Uso/CU-01-Ingreso_Sistema.docx
@@ -1687,6 +1687,16 @@
           <w:lang w:val="en-US"/>
         </w:rPr>
         <w:t>AN01#1</w:t>
+      </w:r>
+      <w:r>
+        <w:rPr>
+          <w:b/>
+          <w:bCs/>
+          <w:sz w:val="20"/>
+          <w:szCs w:val="20"/>
+          <w:lang w:val="en-US"/>
+        </w:rPr>
+        <w:t>, AN02#18</w:t>
       </w:r>
     </w:p>
     <w:p>

</xml_diff>

<commit_message>
Actualizacion reglas de negocio
</commit_message>
<xml_diff>
--- a/Casos de Uso/CU-01-Ingreso_Sistema.docx
+++ b/Casos de Uso/CU-01-Ingreso_Sistema.docx
@@ -1,10 +1,10 @@
 
 <file path=word/document.xml><?xml version="1.0" encoding="utf-8"?>
-<w:document xmlns:wpc="http://schemas.microsoft.com/office/word/2010/wordprocessingCanvas" xmlns:cx="http://schemas.microsoft.com/office/drawing/2014/chartex" xmlns:cx1="http://schemas.microsoft.com/office/drawing/2015/9/8/chartex" xmlns:cx2="http://schemas.microsoft.com/office/drawing/2015/10/21/chartex" xmlns:cx3="http://schemas.microsoft.com/office/drawing/2016/5/9/chartex" xmlns:cx4="http://schemas.microsoft.com/office/drawing/2016/5/10/chartex" xmlns:cx5="http://schemas.microsoft.com/office/drawing/2016/5/11/chartex" xmlns:cx6="http://schemas.microsoft.com/office/drawing/2016/5/12/chartex" xmlns:cx7="http://schemas.microsoft.com/office/drawing/2016/5/13/chartex" xmlns:cx8="http://schemas.microsoft.com/office/drawing/2016/5/14/chartex" xmlns:mc="http://schemas.openxmlformats.org/markup-compatibility/2006" xmlns:aink="http://schemas.microsoft.com/office/drawing/2016/ink" xmlns:am3d="http://schemas.microsoft.com/office/drawing/2017/model3d" xmlns:o="urn:schemas-microsoft-com:office:office" xmlns:r="http://schemas.openxmlformats.org/officeDocument/2006/relationships" xmlns:m="http://schemas.openxmlformats.org/officeDocument/2006/math" xmlns:v="urn:schemas-microsoft-com:vml" xmlns:wp14="http://schemas.microsoft.com/office/word/2010/wordprocessingDrawing" xmlns:wp="http://schemas.openxmlformats.org/drawingml/2006/wordprocessingDrawing" xmlns:w10="urn:schemas-microsoft-com:office:word" xmlns:w="http://schemas.openxmlformats.org/wordprocessingml/2006/main" xmlns:w14="http://schemas.microsoft.com/office/word/2010/wordml" xmlns:w15="http://schemas.microsoft.com/office/word/2012/wordml" xmlns:w16cex="http://schemas.microsoft.com/office/word/2018/wordml/cex" xmlns:w16cid="http://schemas.microsoft.com/office/word/2016/wordml/cid" xmlns:w16="http://schemas.microsoft.com/office/word/2018/wordml" xmlns:w16sdtdh="http://schemas.microsoft.com/office/word/2020/wordml/sdtdatahash" xmlns:w16se="http://schemas.microsoft.com/office/word/2015/wordml/symex" xmlns:wpg="http://schemas.microsoft.com/office/word/2010/wordprocessingGroup" xmlns:wpi="http://schemas.microsoft.com/office/word/2010/wordprocessingInk" xmlns:wne="http://schemas.microsoft.com/office/word/2006/wordml" xmlns:wps="http://schemas.microsoft.com/office/word/2010/wordprocessingShape" mc:Ignorable="w14 w15 w16se w16cid w16 w16cex w16sdtdh wp14">
+<w:document xmlns:wpc="http://schemas.microsoft.com/office/word/2010/wordprocessingCanvas" xmlns:cx="http://schemas.microsoft.com/office/drawing/2014/chartex" xmlns:cx1="http://schemas.microsoft.com/office/drawing/2015/9/8/chartex" xmlns:cx2="http://schemas.microsoft.com/office/drawing/2015/10/21/chartex" xmlns:cx3="http://schemas.microsoft.com/office/drawing/2016/5/9/chartex" xmlns:cx4="http://schemas.microsoft.com/office/drawing/2016/5/10/chartex" xmlns:cx5="http://schemas.microsoft.com/office/drawing/2016/5/11/chartex" xmlns:cx6="http://schemas.microsoft.com/office/drawing/2016/5/12/chartex" xmlns:cx7="http://schemas.microsoft.com/office/drawing/2016/5/13/chartex" xmlns:cx8="http://schemas.microsoft.com/office/drawing/2016/5/14/chartex" xmlns:mc="http://schemas.openxmlformats.org/markup-compatibility/2006" xmlns:aink="http://schemas.microsoft.com/office/drawing/2016/ink" xmlns:am3d="http://schemas.microsoft.com/office/drawing/2017/model3d" xmlns:o="urn:schemas-microsoft-com:office:office" xmlns:oel="http://schemas.microsoft.com/office/2019/extlst" xmlns:r="http://schemas.openxmlformats.org/officeDocument/2006/relationships" xmlns:m="http://schemas.openxmlformats.org/officeDocument/2006/math" xmlns:v="urn:schemas-microsoft-com:vml" xmlns:wp14="http://schemas.microsoft.com/office/word/2010/wordprocessingDrawing" xmlns:wp="http://schemas.openxmlformats.org/drawingml/2006/wordprocessingDrawing" xmlns:w10="urn:schemas-microsoft-com:office:word" xmlns:w="http://schemas.openxmlformats.org/wordprocessingml/2006/main" xmlns:w14="http://schemas.microsoft.com/office/word/2010/wordml" xmlns:w15="http://schemas.microsoft.com/office/word/2012/wordml" xmlns:w16cex="http://schemas.microsoft.com/office/word/2018/wordml/cex" xmlns:w16cid="http://schemas.microsoft.com/office/word/2016/wordml/cid" xmlns:w16="http://schemas.microsoft.com/office/word/2018/wordml" xmlns:w16du="http://schemas.microsoft.com/office/word/2023/wordml/word16du" xmlns:w16sdtdh="http://schemas.microsoft.com/office/word/2020/wordml/sdtdatahash" xmlns:w16sdtfl="http://schemas.microsoft.com/office/word/2024/wordml/sdtformatlock" xmlns:w16se="http://schemas.microsoft.com/office/word/2015/wordml/symex" xmlns:wpg="http://schemas.microsoft.com/office/word/2010/wordprocessingGroup" xmlns:wpi="http://schemas.microsoft.com/office/word/2010/wordprocessingInk" xmlns:wne="http://schemas.microsoft.com/office/word/2006/wordml" xmlns:wps="http://schemas.microsoft.com/office/word/2010/wordprocessingShape" mc:Ignorable="w14 w15 w16se w16cid w16 w16cex w16sdtdh w16sdtfl w16du wp14">
   <w:body>
     <w:p>
       <w:pPr>
-        <w:pStyle w:val="Title"/>
+        <w:pStyle w:val="Ttulo"/>
         <w:spacing w:before="0" w:after="0"/>
         <w:rPr>
           <w:lang w:val="es-ES"/>
@@ -19,7 +19,7 @@
     </w:p>
     <w:p>
       <w:pPr>
-        <w:pStyle w:val="Title"/>
+        <w:pStyle w:val="Ttulo"/>
         <w:spacing w:before="0" w:after="0"/>
         <w:rPr>
           <w:lang w:val="es-ES"/>
@@ -929,7 +929,7 @@
     </w:p>
     <w:p>
       <w:pPr>
-        <w:pStyle w:val="Heading1"/>
+        <w:pStyle w:val="Ttulo1"/>
         <w:numPr>
           <w:ilvl w:val="0"/>
           <w:numId w:val="38"/>
@@ -959,7 +959,7 @@
     </w:p>
     <w:p>
       <w:pPr>
-        <w:pStyle w:val="Heading2"/>
+        <w:pStyle w:val="Ttulo2"/>
         <w:numPr>
           <w:ilvl w:val="1"/>
           <w:numId w:val="38"/>
@@ -1013,7 +1013,7 @@
     </w:p>
     <w:p>
       <w:pPr>
-        <w:pStyle w:val="Heading1"/>
+        <w:pStyle w:val="Ttulo1"/>
         <w:numPr>
           <w:ilvl w:val="0"/>
           <w:numId w:val="38"/>
@@ -1043,7 +1043,7 @@
     </w:p>
     <w:p>
       <w:pPr>
-        <w:pStyle w:val="Heading2"/>
+        <w:pStyle w:val="Ttulo2"/>
         <w:numPr>
           <w:ilvl w:val="1"/>
           <w:numId w:val="38"/>
@@ -1144,7 +1144,7 @@
     </w:p>
     <w:p>
       <w:pPr>
-        <w:pStyle w:val="Heading2"/>
+        <w:pStyle w:val="Ttulo2"/>
         <w:numPr>
           <w:ilvl w:val="1"/>
           <w:numId w:val="38"/>
@@ -1224,7 +1224,7 @@
     </w:p>
     <w:p>
       <w:pPr>
-        <w:pStyle w:val="Heading2"/>
+        <w:pStyle w:val="Ttulo2"/>
         <w:numPr>
           <w:ilvl w:val="1"/>
           <w:numId w:val="38"/>
@@ -1997,7 +1997,7 @@
     </w:p>
     <w:p>
       <w:pPr>
-        <w:pStyle w:val="Heading2"/>
+        <w:pStyle w:val="Ttulo2"/>
         <w:numPr>
           <w:ilvl w:val="1"/>
           <w:numId w:val="38"/>
@@ -2095,21 +2095,35 @@
           <w:numId w:val="43"/>
         </w:numPr>
         <w:rPr>
-          <w:sz w:val="20"/>
-          <w:szCs w:val="20"/>
-          <w:lang w:val="es-ES_tradnl"/>
-        </w:rPr>
-      </w:pPr>
-      <w:r>
-        <w:rPr>
-          <w:sz w:val="20"/>
-          <w:szCs w:val="20"/>
-          <w:lang w:val="es-ES_tradnl"/>
-        </w:rPr>
-        <w:t xml:space="preserve">El sistema muestra un mensaje de error. AN02 # </w:t>
-      </w:r>
-      <w:r>
-        <w:rPr>
+          <w:b/>
+          <w:bCs/>
+          <w:sz w:val="20"/>
+          <w:szCs w:val="20"/>
+          <w:lang w:val="es-ES_tradnl"/>
+        </w:rPr>
+      </w:pPr>
+      <w:r>
+        <w:rPr>
+          <w:sz w:val="20"/>
+          <w:szCs w:val="20"/>
+          <w:lang w:val="es-ES_tradnl"/>
+        </w:rPr>
+        <w:t xml:space="preserve">El sistema muestra un mensaje de error. </w:t>
+      </w:r>
+      <w:r>
+        <w:rPr>
+          <w:b/>
+          <w:bCs/>
+          <w:sz w:val="20"/>
+          <w:szCs w:val="20"/>
+          <w:lang w:val="es-ES_tradnl"/>
+        </w:rPr>
+        <w:t xml:space="preserve">AN02 # </w:t>
+      </w:r>
+      <w:r>
+        <w:rPr>
+          <w:b/>
+          <w:bCs/>
           <w:sz w:val="20"/>
           <w:szCs w:val="20"/>
           <w:lang w:val="es-ES_tradnl"/>
@@ -2346,7 +2360,7 @@
     </w:p>
     <w:p>
       <w:pPr>
-        <w:pStyle w:val="Heading2"/>
+        <w:pStyle w:val="Ttulo2"/>
         <w:numPr>
           <w:ilvl w:val="1"/>
           <w:numId w:val="38"/>
@@ -2426,7 +2440,7 @@
     </w:p>
     <w:p>
       <w:pPr>
-        <w:pStyle w:val="Heading1"/>
+        <w:pStyle w:val="Ttulo1"/>
         <w:numPr>
           <w:ilvl w:val="0"/>
           <w:numId w:val="38"/>
@@ -2527,7 +2541,7 @@
     </w:p>
     <w:p>
       <w:pPr>
-        <w:pStyle w:val="Heading1"/>
+        <w:pStyle w:val="Ttulo1"/>
         <w:numPr>
           <w:ilvl w:val="0"/>
           <w:numId w:val="38"/>
@@ -2834,7 +2848,7 @@
 </file>
 
 <file path=word/endnotes.xml><?xml version="1.0" encoding="utf-8"?>
-<w:endnotes xmlns:wpc="http://schemas.microsoft.com/office/word/2010/wordprocessingCanvas" xmlns:cx="http://schemas.microsoft.com/office/drawing/2014/chartex" xmlns:cx1="http://schemas.microsoft.com/office/drawing/2015/9/8/chartex" xmlns:cx2="http://schemas.microsoft.com/office/drawing/2015/10/21/chartex" xmlns:cx3="http://schemas.microsoft.com/office/drawing/2016/5/9/chartex" xmlns:cx4="http://schemas.microsoft.com/office/drawing/2016/5/10/chartex" xmlns:cx5="http://schemas.microsoft.com/office/drawing/2016/5/11/chartex" xmlns:cx6="http://schemas.microsoft.com/office/drawing/2016/5/12/chartex" xmlns:cx7="http://schemas.microsoft.com/office/drawing/2016/5/13/chartex" xmlns:cx8="http://schemas.microsoft.com/office/drawing/2016/5/14/chartex" xmlns:mc="http://schemas.openxmlformats.org/markup-compatibility/2006" xmlns:aink="http://schemas.microsoft.com/office/drawing/2016/ink" xmlns:am3d="http://schemas.microsoft.com/office/drawing/2017/model3d" xmlns:o="urn:schemas-microsoft-com:office:office" xmlns:r="http://schemas.openxmlformats.org/officeDocument/2006/relationships" xmlns:m="http://schemas.openxmlformats.org/officeDocument/2006/math" xmlns:v="urn:schemas-microsoft-com:vml" xmlns:wp14="http://schemas.microsoft.com/office/word/2010/wordprocessingDrawing" xmlns:wp="http://schemas.openxmlformats.org/drawingml/2006/wordprocessingDrawing" xmlns:w10="urn:schemas-microsoft-com:office:word" xmlns:w="http://schemas.openxmlformats.org/wordprocessingml/2006/main" xmlns:w14="http://schemas.microsoft.com/office/word/2010/wordml" xmlns:w15="http://schemas.microsoft.com/office/word/2012/wordml" xmlns:w16cex="http://schemas.microsoft.com/office/word/2018/wordml/cex" xmlns:w16cid="http://schemas.microsoft.com/office/word/2016/wordml/cid" xmlns:w16="http://schemas.microsoft.com/office/word/2018/wordml" xmlns:w16sdtdh="http://schemas.microsoft.com/office/word/2020/wordml/sdtdatahash" xmlns:w16se="http://schemas.microsoft.com/office/word/2015/wordml/symex" xmlns:wpg="http://schemas.microsoft.com/office/word/2010/wordprocessingGroup" xmlns:wpi="http://schemas.microsoft.com/office/word/2010/wordprocessingInk" xmlns:wne="http://schemas.microsoft.com/office/word/2006/wordml" xmlns:wps="http://schemas.microsoft.com/office/word/2010/wordprocessingShape" mc:Ignorable="w14 w15 w16se w16cid w16 w16cex w16sdtdh wp14">
+<w:endnotes xmlns:wpc="http://schemas.microsoft.com/office/word/2010/wordprocessingCanvas" xmlns:cx="http://schemas.microsoft.com/office/drawing/2014/chartex" xmlns:cx1="http://schemas.microsoft.com/office/drawing/2015/9/8/chartex" xmlns:cx2="http://schemas.microsoft.com/office/drawing/2015/10/21/chartex" xmlns:cx3="http://schemas.microsoft.com/office/drawing/2016/5/9/chartex" xmlns:cx4="http://schemas.microsoft.com/office/drawing/2016/5/10/chartex" xmlns:cx5="http://schemas.microsoft.com/office/drawing/2016/5/11/chartex" xmlns:cx6="http://schemas.microsoft.com/office/drawing/2016/5/12/chartex" xmlns:cx7="http://schemas.microsoft.com/office/drawing/2016/5/13/chartex" xmlns:cx8="http://schemas.microsoft.com/office/drawing/2016/5/14/chartex" xmlns:mc="http://schemas.openxmlformats.org/markup-compatibility/2006" xmlns:aink="http://schemas.microsoft.com/office/drawing/2016/ink" xmlns:am3d="http://schemas.microsoft.com/office/drawing/2017/model3d" xmlns:o="urn:schemas-microsoft-com:office:office" xmlns:oel="http://schemas.microsoft.com/office/2019/extlst" xmlns:r="http://schemas.openxmlformats.org/officeDocument/2006/relationships" xmlns:m="http://schemas.openxmlformats.org/officeDocument/2006/math" xmlns:v="urn:schemas-microsoft-com:vml" xmlns:wp14="http://schemas.microsoft.com/office/word/2010/wordprocessingDrawing" xmlns:wp="http://schemas.openxmlformats.org/drawingml/2006/wordprocessingDrawing" xmlns:w10="urn:schemas-microsoft-com:office:word" xmlns:w="http://schemas.openxmlformats.org/wordprocessingml/2006/main" xmlns:w14="http://schemas.microsoft.com/office/word/2010/wordml" xmlns:w15="http://schemas.microsoft.com/office/word/2012/wordml" xmlns:w16cex="http://schemas.microsoft.com/office/word/2018/wordml/cex" xmlns:w16cid="http://schemas.microsoft.com/office/word/2016/wordml/cid" xmlns:w16="http://schemas.microsoft.com/office/word/2018/wordml" xmlns:w16du="http://schemas.microsoft.com/office/word/2023/wordml/word16du" xmlns:w16sdtdh="http://schemas.microsoft.com/office/word/2020/wordml/sdtdatahash" xmlns:w16sdtfl="http://schemas.microsoft.com/office/word/2024/wordml/sdtformatlock" xmlns:w16se="http://schemas.microsoft.com/office/word/2015/wordml/symex" xmlns:wpg="http://schemas.microsoft.com/office/word/2010/wordprocessingGroup" xmlns:wpi="http://schemas.microsoft.com/office/word/2010/wordprocessingInk" xmlns:wne="http://schemas.microsoft.com/office/word/2006/wordml" xmlns:wps="http://schemas.microsoft.com/office/word/2010/wordprocessingShape" mc:Ignorable="w14 w15 w16se w16cid w16 w16cex w16sdtdh w16sdtfl w16du wp14">
   <w:endnote w:type="separator" w:id="-1">
     <w:p>
       <w:r>
@@ -2853,7 +2867,7 @@
 </file>
 
 <file path=word/footnotes.xml><?xml version="1.0" encoding="utf-8"?>
-<w:footnotes xmlns:wpc="http://schemas.microsoft.com/office/word/2010/wordprocessingCanvas" xmlns:cx="http://schemas.microsoft.com/office/drawing/2014/chartex" xmlns:cx1="http://schemas.microsoft.com/office/drawing/2015/9/8/chartex" xmlns:cx2="http://schemas.microsoft.com/office/drawing/2015/10/21/chartex" xmlns:cx3="http://schemas.microsoft.com/office/drawing/2016/5/9/chartex" xmlns:cx4="http://schemas.microsoft.com/office/drawing/2016/5/10/chartex" xmlns:cx5="http://schemas.microsoft.com/office/drawing/2016/5/11/chartex" xmlns:cx6="http://schemas.microsoft.com/office/drawing/2016/5/12/chartex" xmlns:cx7="http://schemas.microsoft.com/office/drawing/2016/5/13/chartex" xmlns:cx8="http://schemas.microsoft.com/office/drawing/2016/5/14/chartex" xmlns:mc="http://schemas.openxmlformats.org/markup-compatibility/2006" xmlns:aink="http://schemas.microsoft.com/office/drawing/2016/ink" xmlns:am3d="http://schemas.microsoft.com/office/drawing/2017/model3d" xmlns:o="urn:schemas-microsoft-com:office:office" xmlns:r="http://schemas.openxmlformats.org/officeDocument/2006/relationships" xmlns:m="http://schemas.openxmlformats.org/officeDocument/2006/math" xmlns:v="urn:schemas-microsoft-com:vml" xmlns:wp14="http://schemas.microsoft.com/office/word/2010/wordprocessingDrawing" xmlns:wp="http://schemas.openxmlformats.org/drawingml/2006/wordprocessingDrawing" xmlns:w10="urn:schemas-microsoft-com:office:word" xmlns:w="http://schemas.openxmlformats.org/wordprocessingml/2006/main" xmlns:w14="http://schemas.microsoft.com/office/word/2010/wordml" xmlns:w15="http://schemas.microsoft.com/office/word/2012/wordml" xmlns:w16cex="http://schemas.microsoft.com/office/word/2018/wordml/cex" xmlns:w16cid="http://schemas.microsoft.com/office/word/2016/wordml/cid" xmlns:w16="http://schemas.microsoft.com/office/word/2018/wordml" xmlns:w16sdtdh="http://schemas.microsoft.com/office/word/2020/wordml/sdtdatahash" xmlns:w16se="http://schemas.microsoft.com/office/word/2015/wordml/symex" xmlns:wpg="http://schemas.microsoft.com/office/word/2010/wordprocessingGroup" xmlns:wpi="http://schemas.microsoft.com/office/word/2010/wordprocessingInk" xmlns:wne="http://schemas.microsoft.com/office/word/2006/wordml" xmlns:wps="http://schemas.microsoft.com/office/word/2010/wordprocessingShape" mc:Ignorable="w14 w15 w16se w16cid w16 w16cex w16sdtdh wp14">
+<w:footnotes xmlns:wpc="http://schemas.microsoft.com/office/word/2010/wordprocessingCanvas" xmlns:cx="http://schemas.microsoft.com/office/drawing/2014/chartex" xmlns:cx1="http://schemas.microsoft.com/office/drawing/2015/9/8/chartex" xmlns:cx2="http://schemas.microsoft.com/office/drawing/2015/10/21/chartex" xmlns:cx3="http://schemas.microsoft.com/office/drawing/2016/5/9/chartex" xmlns:cx4="http://schemas.microsoft.com/office/drawing/2016/5/10/chartex" xmlns:cx5="http://schemas.microsoft.com/office/drawing/2016/5/11/chartex" xmlns:cx6="http://schemas.microsoft.com/office/drawing/2016/5/12/chartex" xmlns:cx7="http://schemas.microsoft.com/office/drawing/2016/5/13/chartex" xmlns:cx8="http://schemas.microsoft.com/office/drawing/2016/5/14/chartex" xmlns:mc="http://schemas.openxmlformats.org/markup-compatibility/2006" xmlns:aink="http://schemas.microsoft.com/office/drawing/2016/ink" xmlns:am3d="http://schemas.microsoft.com/office/drawing/2017/model3d" xmlns:o="urn:schemas-microsoft-com:office:office" xmlns:oel="http://schemas.microsoft.com/office/2019/extlst" xmlns:r="http://schemas.openxmlformats.org/officeDocument/2006/relationships" xmlns:m="http://schemas.openxmlformats.org/officeDocument/2006/math" xmlns:v="urn:schemas-microsoft-com:vml" xmlns:wp14="http://schemas.microsoft.com/office/word/2010/wordprocessingDrawing" xmlns:wp="http://schemas.openxmlformats.org/drawingml/2006/wordprocessingDrawing" xmlns:w10="urn:schemas-microsoft-com:office:word" xmlns:w="http://schemas.openxmlformats.org/wordprocessingml/2006/main" xmlns:w14="http://schemas.microsoft.com/office/word/2010/wordml" xmlns:w15="http://schemas.microsoft.com/office/word/2012/wordml" xmlns:w16cex="http://schemas.microsoft.com/office/word/2018/wordml/cex" xmlns:w16cid="http://schemas.microsoft.com/office/word/2016/wordml/cid" xmlns:w16="http://schemas.microsoft.com/office/word/2018/wordml" xmlns:w16du="http://schemas.microsoft.com/office/word/2023/wordml/word16du" xmlns:w16sdtdh="http://schemas.microsoft.com/office/word/2020/wordml/sdtdatahash" xmlns:w16sdtfl="http://schemas.microsoft.com/office/word/2024/wordml/sdtformatlock" xmlns:w16se="http://schemas.microsoft.com/office/word/2015/wordml/symex" xmlns:wpg="http://schemas.microsoft.com/office/word/2010/wordprocessingGroup" xmlns:wpi="http://schemas.microsoft.com/office/word/2010/wordprocessingInk" xmlns:wne="http://schemas.microsoft.com/office/word/2006/wordml" xmlns:wps="http://schemas.microsoft.com/office/word/2010/wordprocessingShape" mc:Ignorable="w14 w15 w16se w16cid w16 w16cex w16sdtdh w16sdtfl w16du wp14">
   <w:footnote w:type="separator" w:id="-1">
     <w:p>
       <w:r>
@@ -2872,7 +2886,7 @@
 </file>
 
 <file path=word/numbering.xml><?xml version="1.0" encoding="utf-8"?>
-<w:numbering xmlns:wpc="http://schemas.microsoft.com/office/word/2010/wordprocessingCanvas" xmlns:cx="http://schemas.microsoft.com/office/drawing/2014/chartex" xmlns:cx1="http://schemas.microsoft.com/office/drawing/2015/9/8/chartex" xmlns:cx2="http://schemas.microsoft.com/office/drawing/2015/10/21/chartex" xmlns:cx3="http://schemas.microsoft.com/office/drawing/2016/5/9/chartex" xmlns:cx4="http://schemas.microsoft.com/office/drawing/2016/5/10/chartex" xmlns:cx5="http://schemas.microsoft.com/office/drawing/2016/5/11/chartex" xmlns:cx6="http://schemas.microsoft.com/office/drawing/2016/5/12/chartex" xmlns:cx7="http://schemas.microsoft.com/office/drawing/2016/5/13/chartex" xmlns:cx8="http://schemas.microsoft.com/office/drawing/2016/5/14/chartex" xmlns:mc="http://schemas.openxmlformats.org/markup-compatibility/2006" xmlns:aink="http://schemas.microsoft.com/office/drawing/2016/ink" xmlns:am3d="http://schemas.microsoft.com/office/drawing/2017/model3d" xmlns:o="urn:schemas-microsoft-com:office:office" xmlns:r="http://schemas.openxmlformats.org/officeDocument/2006/relationships" xmlns:m="http://schemas.openxmlformats.org/officeDocument/2006/math" xmlns:v="urn:schemas-microsoft-com:vml" xmlns:wp14="http://schemas.microsoft.com/office/word/2010/wordprocessingDrawing" xmlns:wp="http://schemas.openxmlformats.org/drawingml/2006/wordprocessingDrawing" xmlns:w10="urn:schemas-microsoft-com:office:word" xmlns:w="http://schemas.openxmlformats.org/wordprocessingml/2006/main" xmlns:w14="http://schemas.microsoft.com/office/word/2010/wordml" xmlns:w15="http://schemas.microsoft.com/office/word/2012/wordml" xmlns:w16cex="http://schemas.microsoft.com/office/word/2018/wordml/cex" xmlns:w16cid="http://schemas.microsoft.com/office/word/2016/wordml/cid" xmlns:w16="http://schemas.microsoft.com/office/word/2018/wordml" xmlns:w16sdtdh="http://schemas.microsoft.com/office/word/2020/wordml/sdtdatahash" xmlns:w16se="http://schemas.microsoft.com/office/word/2015/wordml/symex" xmlns:wpg="http://schemas.microsoft.com/office/word/2010/wordprocessingGroup" xmlns:wpi="http://schemas.microsoft.com/office/word/2010/wordprocessingInk" xmlns:wne="http://schemas.microsoft.com/office/word/2006/wordml" xmlns:wps="http://schemas.microsoft.com/office/word/2010/wordprocessingShape" mc:Ignorable="w14 w15 w16se w16cid w16 w16cex w16sdtdh wp14">
+<w:numbering xmlns:wpc="http://schemas.microsoft.com/office/word/2010/wordprocessingCanvas" xmlns:cx="http://schemas.microsoft.com/office/drawing/2014/chartex" xmlns:cx1="http://schemas.microsoft.com/office/drawing/2015/9/8/chartex" xmlns:cx2="http://schemas.microsoft.com/office/drawing/2015/10/21/chartex" xmlns:cx3="http://schemas.microsoft.com/office/drawing/2016/5/9/chartex" xmlns:cx4="http://schemas.microsoft.com/office/drawing/2016/5/10/chartex" xmlns:cx5="http://schemas.microsoft.com/office/drawing/2016/5/11/chartex" xmlns:cx6="http://schemas.microsoft.com/office/drawing/2016/5/12/chartex" xmlns:cx7="http://schemas.microsoft.com/office/drawing/2016/5/13/chartex" xmlns:cx8="http://schemas.microsoft.com/office/drawing/2016/5/14/chartex" xmlns:mc="http://schemas.openxmlformats.org/markup-compatibility/2006" xmlns:aink="http://schemas.microsoft.com/office/drawing/2016/ink" xmlns:am3d="http://schemas.microsoft.com/office/drawing/2017/model3d" xmlns:o="urn:schemas-microsoft-com:office:office" xmlns:oel="http://schemas.microsoft.com/office/2019/extlst" xmlns:r="http://schemas.openxmlformats.org/officeDocument/2006/relationships" xmlns:m="http://schemas.openxmlformats.org/officeDocument/2006/math" xmlns:v="urn:schemas-microsoft-com:vml" xmlns:wp14="http://schemas.microsoft.com/office/word/2010/wordprocessingDrawing" xmlns:wp="http://schemas.openxmlformats.org/drawingml/2006/wordprocessingDrawing" xmlns:w10="urn:schemas-microsoft-com:office:word" xmlns:w="http://schemas.openxmlformats.org/wordprocessingml/2006/main" xmlns:w14="http://schemas.microsoft.com/office/word/2010/wordml" xmlns:w15="http://schemas.microsoft.com/office/word/2012/wordml" xmlns:w16cex="http://schemas.microsoft.com/office/word/2018/wordml/cex" xmlns:w16cid="http://schemas.microsoft.com/office/word/2016/wordml/cid" xmlns:w16="http://schemas.microsoft.com/office/word/2018/wordml" xmlns:w16du="http://schemas.microsoft.com/office/word/2023/wordml/word16du" xmlns:w16sdtdh="http://schemas.microsoft.com/office/word/2020/wordml/sdtdatahash" xmlns:w16sdtfl="http://schemas.microsoft.com/office/word/2024/wordml/sdtformatlock" xmlns:w16se="http://schemas.microsoft.com/office/word/2015/wordml/symex" xmlns:wpg="http://schemas.microsoft.com/office/word/2010/wordprocessingGroup" xmlns:wpi="http://schemas.microsoft.com/office/word/2010/wordprocessingInk" xmlns:wne="http://schemas.microsoft.com/office/word/2006/wordml" xmlns:wps="http://schemas.microsoft.com/office/word/2010/wordprocessingShape" mc:Ignorable="w14 w15 w16se w16cid w16 w16cex w16sdtdh w16sdtfl w16du wp14">
   <w:abstractNum w:abstractNumId="0" w15:restartNumberingAfterBreak="0">
     <w:nsid w:val="02F81A67"/>
     <w:multiLevelType w:val="multilevel"/>
@@ -6894,149 +6908,149 @@
       </w:pPr>
     </w:lvl>
   </w:abstractNum>
-  <w:num w:numId="1">
+  <w:num w:numId="1" w16cid:durableId="520316320">
     <w:abstractNumId w:val="21"/>
   </w:num>
-  <w:num w:numId="2">
+  <w:num w:numId="2" w16cid:durableId="2005355725">
     <w:abstractNumId w:val="2"/>
   </w:num>
-  <w:num w:numId="3">
+  <w:num w:numId="3" w16cid:durableId="1436368025">
     <w:abstractNumId w:val="0"/>
   </w:num>
-  <w:num w:numId="4">
+  <w:num w:numId="4" w16cid:durableId="733968443">
     <w:abstractNumId w:val="19"/>
   </w:num>
-  <w:num w:numId="5">
+  <w:num w:numId="5" w16cid:durableId="63457613">
     <w:abstractNumId w:val="13"/>
   </w:num>
-  <w:num w:numId="6">
+  <w:num w:numId="6" w16cid:durableId="1054505938">
     <w:abstractNumId w:val="7"/>
   </w:num>
-  <w:num w:numId="7">
+  <w:num w:numId="7" w16cid:durableId="1694571362">
     <w:abstractNumId w:val="5"/>
   </w:num>
-  <w:num w:numId="8">
+  <w:num w:numId="8" w16cid:durableId="406612185">
     <w:abstractNumId w:val="32"/>
   </w:num>
-  <w:num w:numId="9">
+  <w:num w:numId="9" w16cid:durableId="605163116">
     <w:abstractNumId w:val="15"/>
   </w:num>
-  <w:num w:numId="10">
+  <w:num w:numId="10" w16cid:durableId="532573431">
     <w:abstractNumId w:val="3"/>
   </w:num>
-  <w:num w:numId="11">
+  <w:num w:numId="11" w16cid:durableId="1809470566">
     <w:abstractNumId w:val="24"/>
   </w:num>
-  <w:num w:numId="12">
+  <w:num w:numId="12" w16cid:durableId="649672430">
     <w:abstractNumId w:val="30"/>
   </w:num>
-  <w:num w:numId="13">
+  <w:num w:numId="13" w16cid:durableId="1784036284">
     <w:abstractNumId w:val="6"/>
   </w:num>
-  <w:num w:numId="14">
+  <w:num w:numId="14" w16cid:durableId="2135587924">
     <w:abstractNumId w:val="14"/>
   </w:num>
-  <w:num w:numId="15">
+  <w:num w:numId="15" w16cid:durableId="459305483">
     <w:abstractNumId w:val="36"/>
   </w:num>
-  <w:num w:numId="16">
+  <w:num w:numId="16" w16cid:durableId="1890721136">
     <w:abstractNumId w:val="41"/>
   </w:num>
-  <w:num w:numId="17">
+  <w:num w:numId="17" w16cid:durableId="7220737">
     <w:abstractNumId w:val="18"/>
   </w:num>
-  <w:num w:numId="18">
+  <w:num w:numId="18" w16cid:durableId="1196625625">
     <w:abstractNumId w:val="9"/>
   </w:num>
-  <w:num w:numId="19">
+  <w:num w:numId="19" w16cid:durableId="2096590279">
     <w:abstractNumId w:val="35"/>
   </w:num>
-  <w:num w:numId="20">
+  <w:num w:numId="20" w16cid:durableId="364521359">
     <w:abstractNumId w:val="39"/>
   </w:num>
-  <w:num w:numId="21">
+  <w:num w:numId="21" w16cid:durableId="571308868">
     <w:abstractNumId w:val="10"/>
   </w:num>
-  <w:num w:numId="22">
+  <w:num w:numId="22" w16cid:durableId="968245459">
     <w:abstractNumId w:val="44"/>
   </w:num>
-  <w:num w:numId="23">
+  <w:num w:numId="23" w16cid:durableId="719784319">
     <w:abstractNumId w:val="42"/>
   </w:num>
-  <w:num w:numId="24">
+  <w:num w:numId="24" w16cid:durableId="1009719897">
     <w:abstractNumId w:val="8"/>
   </w:num>
-  <w:num w:numId="25">
+  <w:num w:numId="25" w16cid:durableId="2077580369">
     <w:abstractNumId w:val="31"/>
   </w:num>
-  <w:num w:numId="26">
+  <w:num w:numId="26" w16cid:durableId="155539216">
     <w:abstractNumId w:val="1"/>
   </w:num>
-  <w:num w:numId="27">
+  <w:num w:numId="27" w16cid:durableId="222258682">
     <w:abstractNumId w:val="23"/>
   </w:num>
-  <w:num w:numId="28">
+  <w:num w:numId="28" w16cid:durableId="2114861390">
     <w:abstractNumId w:val="4"/>
   </w:num>
-  <w:num w:numId="29">
+  <w:num w:numId="29" w16cid:durableId="1678147176">
     <w:abstractNumId w:val="29"/>
   </w:num>
-  <w:num w:numId="30">
+  <w:num w:numId="30" w16cid:durableId="1458141772">
     <w:abstractNumId w:val="16"/>
   </w:num>
-  <w:num w:numId="31">
+  <w:num w:numId="31" w16cid:durableId="1160196406">
     <w:abstractNumId w:val="33"/>
   </w:num>
-  <w:num w:numId="32">
+  <w:num w:numId="32" w16cid:durableId="1121925706">
     <w:abstractNumId w:val="28"/>
   </w:num>
-  <w:num w:numId="33">
+  <w:num w:numId="33" w16cid:durableId="797642971">
     <w:abstractNumId w:val="27"/>
   </w:num>
-  <w:num w:numId="34">
+  <w:num w:numId="34" w16cid:durableId="103114665">
     <w:abstractNumId w:val="17"/>
   </w:num>
-  <w:num w:numId="35">
+  <w:num w:numId="35" w16cid:durableId="1699356338">
     <w:abstractNumId w:val="26"/>
   </w:num>
-  <w:num w:numId="36">
+  <w:num w:numId="36" w16cid:durableId="189414208">
     <w:abstractNumId w:val="12"/>
   </w:num>
-  <w:num w:numId="37">
+  <w:num w:numId="37" w16cid:durableId="942760742">
     <w:abstractNumId w:val="40"/>
   </w:num>
-  <w:num w:numId="38">
+  <w:num w:numId="38" w16cid:durableId="1683506047">
     <w:abstractNumId w:val="11"/>
   </w:num>
-  <w:num w:numId="39">
+  <w:num w:numId="39" w16cid:durableId="44377932">
     <w:abstractNumId w:val="43"/>
   </w:num>
-  <w:num w:numId="40">
+  <w:num w:numId="40" w16cid:durableId="1279801104">
     <w:abstractNumId w:val="45"/>
   </w:num>
-  <w:num w:numId="41">
+  <w:num w:numId="41" w16cid:durableId="177350664">
     <w:abstractNumId w:val="22"/>
   </w:num>
-  <w:num w:numId="42">
+  <w:num w:numId="42" w16cid:durableId="2144233151">
     <w:abstractNumId w:val="25"/>
   </w:num>
-  <w:num w:numId="43">
+  <w:num w:numId="43" w16cid:durableId="1933390617">
     <w:abstractNumId w:val="34"/>
   </w:num>
-  <w:num w:numId="44">
+  <w:num w:numId="44" w16cid:durableId="885216940">
     <w:abstractNumId w:val="38"/>
   </w:num>
-  <w:num w:numId="45">
+  <w:num w:numId="45" w16cid:durableId="1525092899">
     <w:abstractNumId w:val="37"/>
   </w:num>
-  <w:num w:numId="46">
+  <w:num w:numId="46" w16cid:durableId="2081900438">
     <w:abstractNumId w:val="20"/>
   </w:num>
 </w:numbering>
 </file>
 
 <file path=word/styles.xml><?xml version="1.0" encoding="utf-8"?>
-<w:styles xmlns:mc="http://schemas.openxmlformats.org/markup-compatibility/2006" xmlns:r="http://schemas.openxmlformats.org/officeDocument/2006/relationships" xmlns:w="http://schemas.openxmlformats.org/wordprocessingml/2006/main" xmlns:w14="http://schemas.microsoft.com/office/word/2010/wordml" xmlns:w15="http://schemas.microsoft.com/office/word/2012/wordml" xmlns:w16cex="http://schemas.microsoft.com/office/word/2018/wordml/cex" xmlns:w16cid="http://schemas.microsoft.com/office/word/2016/wordml/cid" xmlns:w16="http://schemas.microsoft.com/office/word/2018/wordml" xmlns:w16sdtdh="http://schemas.microsoft.com/office/word/2020/wordml/sdtdatahash" xmlns:w16se="http://schemas.microsoft.com/office/word/2015/wordml/symex" mc:Ignorable="w14 w15 w16se w16cid w16 w16cex w16sdtdh">
+<w:styles xmlns:mc="http://schemas.openxmlformats.org/markup-compatibility/2006" xmlns:r="http://schemas.openxmlformats.org/officeDocument/2006/relationships" xmlns:w="http://schemas.openxmlformats.org/wordprocessingml/2006/main" xmlns:w14="http://schemas.microsoft.com/office/word/2010/wordml" xmlns:w15="http://schemas.microsoft.com/office/word/2012/wordml" xmlns:w16cex="http://schemas.microsoft.com/office/word/2018/wordml/cex" xmlns:w16cid="http://schemas.microsoft.com/office/word/2016/wordml/cid" xmlns:w16="http://schemas.microsoft.com/office/word/2018/wordml" xmlns:w16du="http://schemas.microsoft.com/office/word/2023/wordml/word16du" xmlns:w16sdtdh="http://schemas.microsoft.com/office/word/2020/wordml/sdtdatahash" xmlns:w16sdtfl="http://schemas.microsoft.com/office/word/2024/wordml/sdtformatlock" xmlns:w16se="http://schemas.microsoft.com/office/word/2015/wordml/symex" mc:Ignorable="w14 w15 w16se w16cid w16 w16cex w16sdtdh w16sdtfl w16du">
   <w:docDefaults>
     <w:rPrDefault>
       <w:rPr>
@@ -7340,7 +7354,7 @@
       <w:lang w:val="es-ES" w:eastAsia="es-ES"/>
     </w:rPr>
   </w:style>
-  <w:style w:type="paragraph" w:styleId="Heading1">
+  <w:style w:type="paragraph" w:styleId="Ttulo1">
     <w:name w:val="heading 1"/>
     <w:basedOn w:val="Normal"/>
     <w:qFormat/>
@@ -7357,7 +7371,7 @@
       <w:szCs w:val="48"/>
     </w:rPr>
   </w:style>
-  <w:style w:type="paragraph" w:styleId="Heading2">
+  <w:style w:type="paragraph" w:styleId="Ttulo2">
     <w:name w:val="heading 2"/>
     <w:basedOn w:val="Normal"/>
     <w:qFormat/>
@@ -7373,13 +7387,13 @@
       <w:szCs w:val="36"/>
     </w:rPr>
   </w:style>
-  <w:style w:type="character" w:default="1" w:styleId="DefaultParagraphFont">
+  <w:style w:type="character" w:default="1" w:styleId="Fuentedeprrafopredeter">
     <w:name w:val="Default Paragraph Font"/>
     <w:uiPriority w:val="1"/>
     <w:semiHidden/>
     <w:unhideWhenUsed/>
   </w:style>
-  <w:style w:type="table" w:default="1" w:styleId="TableNormal">
+  <w:style w:type="table" w:default="1" w:styleId="Tablanormal">
     <w:name w:val="Normal Table"/>
     <w:uiPriority w:val="99"/>
     <w:semiHidden/>
@@ -7394,7 +7408,7 @@
       </w:tblCellMar>
     </w:tblPr>
   </w:style>
-  <w:style w:type="numbering" w:default="1" w:styleId="NoList">
+  <w:style w:type="numbering" w:default="1" w:styleId="Sinlista">
     <w:name w:val="No List"/>
     <w:uiPriority w:val="99"/>
     <w:semiHidden/>
@@ -7408,7 +7422,7 @@
       <w:spacing w:before="100" w:beforeAutospacing="1" w:after="100" w:afterAutospacing="1"/>
     </w:pPr>
   </w:style>
-  <w:style w:type="paragraph" w:styleId="TOC1">
+  <w:style w:type="paragraph" w:styleId="TDC1">
     <w:name w:val="toc 1"/>
     <w:basedOn w:val="Normal"/>
     <w:rsid w:val="000D097C"/>
@@ -7416,7 +7430,7 @@
       <w:spacing w:before="100" w:beforeAutospacing="1" w:after="100" w:afterAutospacing="1"/>
     </w:pPr>
   </w:style>
-  <w:style w:type="character" w:styleId="Hyperlink">
+  <w:style w:type="character" w:styleId="Hipervnculo">
     <w:name w:val="Hyperlink"/>
     <w:rsid w:val="000D097C"/>
     <w:rPr>
@@ -7424,7 +7438,7 @@
       <w:u w:val="single"/>
     </w:rPr>
   </w:style>
-  <w:style w:type="paragraph" w:styleId="TOC2">
+  <w:style w:type="paragraph" w:styleId="TDC2">
     <w:name w:val="toc 2"/>
     <w:basedOn w:val="Normal"/>
     <w:rsid w:val="000D097C"/>
@@ -7432,7 +7446,7 @@
       <w:spacing w:before="100" w:beforeAutospacing="1" w:after="100" w:afterAutospacing="1"/>
     </w:pPr>
   </w:style>
-  <w:style w:type="paragraph" w:styleId="BodyTextIndent3">
+  <w:style w:type="paragraph" w:styleId="Sangra3detindependiente">
     <w:name w:val="Body Text Indent 3"/>
     <w:basedOn w:val="Normal"/>
     <w:rsid w:val="000D097C"/>
@@ -7440,10 +7454,10 @@
       <w:spacing w:before="100" w:beforeAutospacing="1" w:after="100" w:afterAutospacing="1"/>
     </w:pPr>
   </w:style>
-  <w:style w:type="paragraph" w:styleId="Header">
+  <w:style w:type="paragraph" w:styleId="Encabezado">
     <w:name w:val="header"/>
     <w:basedOn w:val="Normal"/>
-    <w:link w:val="HeaderChar"/>
+    <w:link w:val="EncabezadoCar"/>
     <w:uiPriority w:val="99"/>
     <w:rsid w:val="000D097C"/>
     <w:pPr>
@@ -7460,16 +7474,16 @@
   </w:style>
   <w:style w:type="paragraph" w:customStyle="1" w:styleId="ByLine">
     <w:name w:val="ByLine"/>
-    <w:basedOn w:val="Title"/>
+    <w:basedOn w:val="Ttulo"/>
     <w:rsid w:val="00F6349F"/>
     <w:rPr>
       <w:sz w:val="28"/>
     </w:rPr>
   </w:style>
-  <w:style w:type="paragraph" w:styleId="Title">
+  <w:style w:type="paragraph" w:styleId="Ttulo">
     <w:name w:val="Title"/>
     <w:basedOn w:val="Normal"/>
-    <w:link w:val="TitleChar"/>
+    <w:link w:val="TtuloCar"/>
     <w:qFormat/>
     <w:rsid w:val="00F6349F"/>
     <w:pPr>
@@ -7485,9 +7499,9 @@
       <w:lang w:val="en-US" w:eastAsia="en-US"/>
     </w:rPr>
   </w:style>
-  <w:style w:type="character" w:customStyle="1" w:styleId="TitleChar">
-    <w:name w:val="Title Char"/>
-    <w:link w:val="Title"/>
+  <w:style w:type="character" w:customStyle="1" w:styleId="TtuloCar">
+    <w:name w:val="Título Car"/>
+    <w:link w:val="Ttulo"/>
     <w:rsid w:val="00F6349F"/>
     <w:rPr>
       <w:rFonts w:ascii="Arial" w:hAnsi="Arial"/>
@@ -7514,12 +7528,12 @@
       <w:lang w:val="en-US" w:eastAsia="en-US"/>
     </w:rPr>
   </w:style>
-  <w:style w:type="character" w:styleId="LineNumber">
+  <w:style w:type="character" w:styleId="Nmerodelnea">
     <w:name w:val="line number"/>
-    <w:basedOn w:val="DefaultParagraphFont"/>
+    <w:basedOn w:val="Fuentedeprrafopredeter"/>
     <w:rsid w:val="008F2F81"/>
   </w:style>
-  <w:style w:type="paragraph" w:styleId="ListParagraph">
+  <w:style w:type="paragraph" w:styleId="Prrafodelista">
     <w:name w:val="List Paragraph"/>
     <w:basedOn w:val="Normal"/>
     <w:uiPriority w:val="34"/>
@@ -7529,10 +7543,10 @@
       <w:ind w:left="708"/>
     </w:pPr>
   </w:style>
-  <w:style w:type="paragraph" w:styleId="Footer">
+  <w:style w:type="paragraph" w:styleId="Piedepgina">
     <w:name w:val="footer"/>
     <w:basedOn w:val="Normal"/>
-    <w:link w:val="FooterChar"/>
+    <w:link w:val="PiedepginaCar"/>
     <w:uiPriority w:val="99"/>
     <w:rsid w:val="00344F2B"/>
     <w:pPr>
@@ -7542,9 +7556,9 @@
       </w:tabs>
     </w:pPr>
   </w:style>
-  <w:style w:type="character" w:customStyle="1" w:styleId="FooterChar">
-    <w:name w:val="Footer Char"/>
-    <w:link w:val="Footer"/>
+  <w:style w:type="character" w:customStyle="1" w:styleId="PiedepginaCar">
+    <w:name w:val="Pie de página Car"/>
+    <w:link w:val="Piedepgina"/>
     <w:uiPriority w:val="99"/>
     <w:rsid w:val="00344F2B"/>
     <w:rPr>
@@ -7553,9 +7567,9 @@
       <w:lang w:val="es-ES" w:eastAsia="es-ES"/>
     </w:rPr>
   </w:style>
-  <w:style w:type="character" w:customStyle="1" w:styleId="HeaderChar">
-    <w:name w:val="Header Char"/>
-    <w:link w:val="Header"/>
+  <w:style w:type="character" w:customStyle="1" w:styleId="EncabezadoCar">
+    <w:name w:val="Encabezado Car"/>
+    <w:link w:val="Encabezado"/>
     <w:uiPriority w:val="99"/>
     <w:rsid w:val="00344F2B"/>
     <w:rPr>
@@ -7564,10 +7578,10 @@
       <w:lang w:val="es-ES" w:eastAsia="es-ES"/>
     </w:rPr>
   </w:style>
-  <w:style w:type="paragraph" w:styleId="BalloonText">
+  <w:style w:type="paragraph" w:styleId="Textodeglobo">
     <w:name w:val="Balloon Text"/>
     <w:basedOn w:val="Normal"/>
-    <w:link w:val="BalloonTextChar"/>
+    <w:link w:val="TextodegloboCar"/>
     <w:rsid w:val="00344F2B"/>
     <w:rPr>
       <w:rFonts w:ascii="Tahoma" w:hAnsi="Tahoma" w:cs="Tahoma"/>
@@ -7575,9 +7589,9 @@
       <w:szCs w:val="16"/>
     </w:rPr>
   </w:style>
-  <w:style w:type="character" w:customStyle="1" w:styleId="BalloonTextChar">
-    <w:name w:val="Balloon Text Char"/>
-    <w:link w:val="BalloonText"/>
+  <w:style w:type="character" w:customStyle="1" w:styleId="TextodegloboCar">
+    <w:name w:val="Texto de globo Car"/>
+    <w:link w:val="Textodeglobo"/>
     <w:rsid w:val="00344F2B"/>
     <w:rPr>
       <w:rFonts w:ascii="Tahoma" w:hAnsi="Tahoma" w:cs="Tahoma"/>
@@ -7586,18 +7600,18 @@
       <w:lang w:val="es-ES" w:eastAsia="es-ES"/>
     </w:rPr>
   </w:style>
-  <w:style w:type="paragraph" w:styleId="BodyText">
+  <w:style w:type="paragraph" w:styleId="Textoindependiente">
     <w:name w:val="Body Text"/>
     <w:basedOn w:val="Normal"/>
-    <w:link w:val="BodyTextChar"/>
+    <w:link w:val="TextoindependienteCar"/>
     <w:rsid w:val="00FF438A"/>
     <w:pPr>
       <w:spacing w:after="120"/>
     </w:pPr>
   </w:style>
-  <w:style w:type="character" w:customStyle="1" w:styleId="BodyTextChar">
-    <w:name w:val="Body Text Char"/>
-    <w:link w:val="BodyText"/>
+  <w:style w:type="character" w:customStyle="1" w:styleId="TextoindependienteCar">
+    <w:name w:val="Texto independiente Car"/>
+    <w:link w:val="Textoindependiente"/>
     <w:rsid w:val="00FF438A"/>
     <w:rPr>
       <w:sz w:val="24"/>
@@ -7605,32 +7619,32 @@
       <w:lang w:val="es-ES" w:eastAsia="es-ES"/>
     </w:rPr>
   </w:style>
-  <w:style w:type="paragraph" w:styleId="EndnoteText">
+  <w:style w:type="paragraph" w:styleId="Textonotaalfinal">
     <w:name w:val="endnote text"/>
     <w:basedOn w:val="Normal"/>
-    <w:link w:val="EndnoteTextChar"/>
+    <w:link w:val="TextonotaalfinalCar"/>
     <w:rsid w:val="00A83ADC"/>
     <w:rPr>
       <w:sz w:val="20"/>
       <w:szCs w:val="20"/>
     </w:rPr>
   </w:style>
-  <w:style w:type="character" w:customStyle="1" w:styleId="EndnoteTextChar">
-    <w:name w:val="Endnote Text Char"/>
-    <w:link w:val="EndnoteText"/>
+  <w:style w:type="character" w:customStyle="1" w:styleId="TextonotaalfinalCar">
+    <w:name w:val="Texto nota al final Car"/>
+    <w:link w:val="Textonotaalfinal"/>
     <w:rsid w:val="00A83ADC"/>
     <w:rPr>
       <w:lang w:val="es-ES" w:eastAsia="es-ES"/>
     </w:rPr>
   </w:style>
-  <w:style w:type="character" w:styleId="EndnoteReference">
+  <w:style w:type="character" w:styleId="Refdenotaalfinal">
     <w:name w:val="endnote reference"/>
     <w:rsid w:val="00A83ADC"/>
     <w:rPr>
       <w:vertAlign w:val="superscript"/>
     </w:rPr>
   </w:style>
-  <w:style w:type="paragraph" w:styleId="Revision">
+  <w:style w:type="paragraph" w:styleId="Revisin">
     <w:name w:val="Revision"/>
     <w:hidden/>
     <w:uiPriority w:val="99"/>
@@ -7642,9 +7656,9 @@
       <w:lang w:val="es-ES" w:eastAsia="es-ES"/>
     </w:rPr>
   </w:style>
-  <w:style w:type="table" w:styleId="TableGrid">
+  <w:style w:type="table" w:styleId="Tablaconcuadrcula">
     <w:name w:val="Table Grid"/>
-    <w:basedOn w:val="TableNormal"/>
+    <w:basedOn w:val="Tablanormal"/>
     <w:uiPriority w:val="1"/>
     <w:rsid w:val="00557FB4"/>
     <w:rPr>

</xml_diff>